<commit_message>
Restore docs and sync coursework report
</commit_message>
<xml_diff>
--- a/Матвиенко_курсовая_ПСП_layout.docx
+++ b/Матвиенко_курсовая_ПСП_layout.docx
@@ -5828,79 +5828,7 @@
         <w:jc w:val="both"/>
       </w:pPr>
       <w:r>
-        <w:t xml:space="preserve">База данных </w:t>
-      </w:r>
-      <w:proofErr w:type="spellStart"/>
-      <w:r>
-        <w:t>Farm</w:t>
-      </w:r>
-      <w:proofErr w:type="spellEnd"/>
-      <w:r>
-        <w:t xml:space="preserve"> Sales сетевого приложения состоит из таблиц </w:t>
-      </w:r>
-      <w:proofErr w:type="spellStart"/>
-      <w:r>
-        <w:t>users</w:t>
-      </w:r>
-      <w:proofErr w:type="spellEnd"/>
-      <w:r>
-        <w:t xml:space="preserve">, </w:t>
-      </w:r>
-      <w:proofErr w:type="spellStart"/>
-      <w:r>
-        <w:t>store_addresses</w:t>
-      </w:r>
-      <w:proofErr w:type="spellEnd"/>
-      <w:r>
-        <w:t xml:space="preserve">, </w:t>
-      </w:r>
-      <w:proofErr w:type="spellStart"/>
-      <w:r>
-        <w:t>products</w:t>
-      </w:r>
-      <w:proofErr w:type="spellEnd"/>
-      <w:r>
-        <w:t xml:space="preserve">, </w:t>
-      </w:r>
-      <w:proofErr w:type="spellStart"/>
-      <w:r>
-        <w:t>orders</w:t>
-      </w:r>
-      <w:proofErr w:type="spellEnd"/>
-      <w:r>
-        <w:t xml:space="preserve">, </w:t>
-      </w:r>
-      <w:proofErr w:type="spellStart"/>
-      <w:r>
-        <w:t>order_items</w:t>
-      </w:r>
-      <w:proofErr w:type="spellEnd"/>
-      <w:r>
-        <w:t xml:space="preserve">, </w:t>
-      </w:r>
-      <w:proofErr w:type="spellStart"/>
-      <w:r>
-        <w:t>stock_movements</w:t>
-      </w:r>
-      <w:proofErr w:type="spellEnd"/>
-      <w:r>
-        <w:t xml:space="preserve">, </w:t>
-      </w:r>
-      <w:proofErr w:type="spellStart"/>
-      <w:r>
-        <w:t>order_timeline_events</w:t>
-      </w:r>
-      <w:proofErr w:type="spellEnd"/>
-      <w:r>
-        <w:t xml:space="preserve"> и </w:t>
-      </w:r>
-      <w:proofErr w:type="spellStart"/>
-      <w:r>
-        <w:t>realtime_notifications</w:t>
-      </w:r>
-      <w:proofErr w:type="spellEnd"/>
-      <w:r>
-        <w:t>. Каждая таблица выполняет собственную функцию, а вместе они образуют полный контур сопровождения заказа и логистики (рисунок 2.2).</w:t>
+        <w:t>База данных Farm Sales сетевого приложения состоит из прикладных таблиц users, store_addresses, products, orders, order_items, audit_logs, stock_movements, order_timeline_events и realtime_notifications. Дополнительно Flyway ведёт служебную таблицу flyway_schema_history. Вместе эти таблицы образуют полный контур сопровождения заказа и логистики (рисунок 2.2).</w:t>
       </w:r>
     </w:p>
     <w:p>
@@ -6347,13 +6275,8 @@
         <w:spacing w:before="0" w:after="0"/>
         <w:jc w:val="both"/>
       </w:pPr>
-      <w:proofErr w:type="spellStart"/>
-      <w:r>
-        <w:t>manager_id</w:t>
-      </w:r>
-      <w:proofErr w:type="spellEnd"/>
-      <w:r>
-        <w:t xml:space="preserve"> – менеджер, обработавший заявку</w:t>
+      <w:r>
+        <w:t>approved_by_manager_id – менеджер, одобривший заявку</w:t>
       </w:r>
     </w:p>
     <w:p>
@@ -6362,28 +6285,19 @@
         <w:spacing w:before="0" w:after="0"/>
         <w:jc w:val="both"/>
       </w:pPr>
-      <w:proofErr w:type="spellStart"/>
-      <w:r>
-        <w:t>driver_id</w:t>
-      </w:r>
-      <w:proofErr w:type="spellEnd"/>
-      <w:r>
-        <w:t xml:space="preserve"> – назначенный водитель</w:t>
-      </w:r>
-    </w:p>
+      <w:r>
+        <w:t>assigned_driver_id – назначенный водитель</w:t>
+      </w:r>
+    </w:p>
+    <CT_P/>
     <w:p>
       <w:pPr>
         <w:pStyle w:val="ds-markdown-paragraph"/>
         <w:spacing w:before="0" w:after="0"/>
         <w:jc w:val="both"/>
       </w:pPr>
-      <w:proofErr w:type="spellStart"/>
-      <w:r>
-        <w:t>status</w:t>
-      </w:r>
-      <w:proofErr w:type="spellEnd"/>
-      <w:r>
-        <w:t xml:space="preserve"> – состояние заказа (CREATED, APPROVED, ASSIGNED, DELIVERED)</w:t>
+      <w:r>
+        <w:t>assigned_by_logistician_id – логист, назначивший водителя</w:t>
       </w:r>
     </w:p>
     <w:p>
@@ -6495,31 +6409,7 @@
         <w:jc w:val="both"/>
       </w:pPr>
       <w:r>
-        <w:t xml:space="preserve">Таблицы </w:t>
-      </w:r>
-      <w:proofErr w:type="spellStart"/>
-      <w:r>
-        <w:t>stock_movements</w:t>
-      </w:r>
-      <w:proofErr w:type="spellEnd"/>
-      <w:r>
-        <w:t xml:space="preserve">, </w:t>
-      </w:r>
-      <w:proofErr w:type="spellStart"/>
-      <w:r>
-        <w:t>order_timeline_events</w:t>
-      </w:r>
-      <w:proofErr w:type="spellEnd"/>
-      <w:r>
-        <w:t xml:space="preserve"> и </w:t>
-      </w:r>
-      <w:proofErr w:type="spellStart"/>
-      <w:r>
-        <w:t>realtime_notifications</w:t>
-      </w:r>
-      <w:proofErr w:type="spellEnd"/>
-      <w:r>
-        <w:t xml:space="preserve"> – обслуживают историю изменений, движение остатков и уведомления интерфейса</w:t>
+        <w:t>Таблицы audit_logs, stock_movements, order_timeline_events и realtime_notifications – обслуживают аудит действий, историю изменений, движение остатков и уведомления интерфейса</w:t>
       </w:r>
     </w:p>
     <w:p>
@@ -6545,31 +6435,7 @@
         <w:jc w:val="both"/>
       </w:pPr>
       <w:r>
-        <w:t xml:space="preserve">Приложение имеет модульную структуру, где корневой уровень содержит </w:t>
-      </w:r>
-      <w:proofErr w:type="spellStart"/>
-      <w:r>
-        <w:t>deploy</w:t>
-      </w:r>
-      <w:proofErr w:type="spellEnd"/>
-      <w:r>
-        <w:t xml:space="preserve">-конфигурацию, документацию и эксплуатационные файлы, а логика системы разделена между </w:t>
-      </w:r>
-      <w:proofErr w:type="spellStart"/>
-      <w:r>
-        <w:t>backend</w:t>
-      </w:r>
-      <w:proofErr w:type="spellEnd"/>
-      <w:r>
-        <w:t xml:space="preserve"> и </w:t>
-      </w:r>
-      <w:proofErr w:type="spellStart"/>
-      <w:r>
-        <w:t>frontend</w:t>
-      </w:r>
-      <w:proofErr w:type="spellEnd"/>
-      <w:r>
-        <w:t>. Такая организация соответствует реальной структуре репозитория, представленной на рисунке 2.3.</w:t>
+        <w:t>Приложение имеет модульную структуру, где корневой уровень содержит deploy-конфигурацию и эксплуатационные файлы, а логика системы разделена между backend и frontend. Такая организация соответствует реальной структуре репозитория, представленной на рисунке 2.3.</w:t>
       </w:r>
     </w:p>
     <w:p>
@@ -8637,13 +8503,8 @@
           <w:szCs w:val="28"/>
         </w:rPr>
       </w:pPr>
-      <w:proofErr w:type="spellStart"/>
-      <w:r>
-        <w:t>Deploy</w:t>
-      </w:r>
-      <w:proofErr w:type="spellEnd"/>
-      <w:r>
-        <w:t>-конфигурация, сценарии подготовки отчётных данных и эксплуатационная документация также расположены в общем слое проекта.</w:t>
+      <w:r>
+        <w:t>Deploy-конфигурация и сценарии подготовки отчётных данных также расположены в общем слое проекта.</w:t>
       </w:r>
     </w:p>
     <w:p>
@@ -8657,15 +8518,7 @@
         </w:rPr>
       </w:pPr>
       <w:r>
-        <w:t xml:space="preserve">Дополнительный слой документации содержит материалы по публичному развёртыванию и проверке </w:t>
-      </w:r>
-      <w:proofErr w:type="spellStart"/>
-      <w:r>
-        <w:t>задеплоенной</w:t>
-      </w:r>
-      <w:proofErr w:type="spellEnd"/>
-      <w:r>
-        <w:t xml:space="preserve"> версии.</w:t>
+        <w:t>Дополнительные эксплуатационные файлы используются для публичного развёртывания и проверки задеплоенной версии.</w:t>
       </w:r>
     </w:p>
     <w:p>
@@ -8768,15 +8621,7 @@
         </w:rPr>
       </w:pPr>
       <w:r>
-        <w:t xml:space="preserve">Контрольная проверка проекта выполнялась через публичную версию сайта https://farmer.indevs.in. Статическая клиентская часть обращается к </w:t>
-      </w:r>
-      <w:proofErr w:type="spellStart"/>
-      <w:r>
-        <w:t>backend</w:t>
-      </w:r>
-      <w:proofErr w:type="spellEnd"/>
-      <w:r>
-        <w:t xml:space="preserve"> API https://farm-sales-backend.onrender.com/api, где работают авторизация, каталог, заказы, отчёты и логистические расчёты. В проверочном снимке публичного API система содержит 30 адресов магазинов, каталог из 250 товарных позиций и 32 заказа; из них 29 находятся в статусе ASSIGNED, 3 — DELIVERED, 0 — APPROVED.</w:t>
+        <w:t>Контрольная проверка проекта выполнялась через публичную версию сайта https://farmer.indevs.in. Статическая клиентская часть обращается к backend API https://farm-sales-backend.onrender.com/api, где работают авторизация, каталог, заказы, отчёты и логистические расчёты. После выполнения сценария reset публичный API содержит 30 адресов магазинов, каталог из 200 товарных позиций и 30 заказов; все 30 заказов находятся в статусе APPROVED.</w:t>
       </w:r>
     </w:p>
     <w:p>
@@ -8790,23 +8635,7 @@
         </w:rPr>
       </w:pPr>
       <w:r>
-        <w:t xml:space="preserve">Для нового запуска </w:t>
-      </w:r>
-      <w:proofErr w:type="spellStart"/>
-      <w:r>
-        <w:t>preview</w:t>
-      </w:r>
-      <w:proofErr w:type="spellEnd"/>
-      <w:r>
-        <w:t xml:space="preserve"> на момент проверки нет заказов в статусе APPROVED, поскольку основной логистический набор уже распределён между водителями. Поэтому </w:t>
-      </w:r>
-      <w:proofErr w:type="spellStart"/>
-      <w:r>
-        <w:t>preview</w:t>
-      </w:r>
-      <w:proofErr w:type="spellEnd"/>
-      <w:r>
-        <w:t xml:space="preserve"> транспортной задачи корректно вернул 0 запланированных документов, 0 нераспределённых документов и суммарный оценочный километраж 0.0 км.</w:t>
+        <w:t>После reset логист открывает модуль назначений и запускает preview транспортной задачи. Система видит 30 заказов в статусе APPROVED, группирует их по 30 точкам доставки и готовит план распределения между водителями с учётом веса, объёма и дорожного километража.</w:t>
       </w:r>
     </w:p>
     <w:p>
@@ -8866,13 +8695,8 @@
         </w:rPr>
       </w:pPr>
       <w:r>
-        <w:t xml:space="preserve">Рисунок 2.14 – Состояние транспортного модуля без новых заказов для </w:t>
-      </w:r>
-      <w:proofErr w:type="spellStart"/>
-      <w:r>
-        <w:t>preview</w:t>
-      </w:r>
-      <w:proofErr w:type="spellEnd"/>
+        <w:t>Рисунок 2.14 – Preview транспортного модуля для 30 заказов</w:t>
+      </w:r>
     </w:p>
     <w:p>
       <w:pPr>
@@ -8885,7 +8709,7 @@
         </w:rPr>
       </w:pPr>
       <w:r>
-        <w:t>Сводка по маршрутам показала текущее состояние публичной базы: новых заказов в статусе APPROVED для повторного расчёта не было; действующий маршрутный контур содержит 29 назначенных заказов и 3 доставленных. При появлении новых заказов в статусе APPROVED этот же экран используется для расчёта маршрутов, а менеджерский раздел отчётности остаётся доступным для выгрузки данных по заказам.</w:t>
+        <w:t>Сводка по маршрутам показывает распределение базового набора между водителями, количество рейсов, последовательность остановок и оценочный километраж. После подтверждения плана заказы переходят из APPROVED в ASSIGNED, а водительский интерфейс получает назначенные доставки.</w:t>
       </w:r>
     </w:p>
     <w:p>
@@ -10397,40 +10221,6 @@
       </w:pPr>
       <w:r>
         <w:t>8 Документация по Spring Security [Электронный ресурс]. – Режим доступа: https://docs.spring.io/spring-security/reference/. – Дата доступа: 23.04.2026.</w:t>
-      </w:r>
-    </w:p>
-    <w:p>
-      <w:pPr>
-        <w:pStyle w:val="a5"/>
-        <w:spacing w:after="0"/>
-        <w:jc w:val="both"/>
-        <w:rPr>
-          <w:lang w:val="en-US"/>
-        </w:rPr>
-      </w:pPr>
-      <w:r>
-        <w:rPr>
-          <w:lang w:val="en-US"/>
-        </w:rPr>
-        <w:t xml:space="preserve">9 </w:t>
-      </w:r>
-      <w:r>
-        <w:t>Материалы</w:t>
-      </w:r>
-      <w:r>
-        <w:rPr>
-          <w:lang w:val="en-US"/>
-        </w:rPr>
-        <w:t xml:space="preserve"> </w:t>
-      </w:r>
-      <w:r>
-        <w:t>проекта</w:t>
-      </w:r>
-      <w:r>
-        <w:rPr>
-          <w:lang w:val="en-US"/>
-        </w:rPr>
-        <w:t xml:space="preserve"> Farm Sales: README.md, docs/PROJECT_OVERVIEW.md, docs/defense/scenario.md, docs/defense/transport-task.md.</w:t>
       </w:r>
     </w:p>
     <w:p>

</xml_diff>

<commit_message>
Fix coursework report Word compatibility
</commit_message>
<xml_diff>
--- a/Матвиенко_курсовая_ПСП_layout.docx
+++ b/Матвиенко_курсовая_ПСП_layout.docx
@@ -1248,21 +1248,12 @@
                                 </w:rPr>
                                 <w:t>И</w:t>
                               </w:r>
-                              <w:proofErr w:type="spellStart"/>
                               <w:r>
                                 <w:rPr>
                                   <w:rFonts w:ascii="Times New Roman" w:hAnsi="Times New Roman"/>
                                   <w:sz w:val="20"/>
                                 </w:rPr>
-                                <w:t>зм</w:t>
-                              </w:r>
-                              <w:proofErr w:type="spellEnd"/>
-                              <w:r>
-                                <w:rPr>
-                                  <w:rFonts w:ascii="Times New Roman" w:hAnsi="Times New Roman"/>
-                                  <w:sz w:val="20"/>
-                                </w:rPr>
-                                <w:t>.</w:t>
+                                <w:t>зм.</w:t>
                               </w:r>
                             </w:p>
                           </w:txbxContent>
@@ -1386,23 +1377,7 @@
                                   <w:rFonts w:ascii="Times New Roman" w:hAnsi="Times New Roman"/>
                                   <w:sz w:val="20"/>
                                 </w:rPr>
-                                <w:t xml:space="preserve">№ </w:t>
-                              </w:r>
-                              <w:proofErr w:type="spellStart"/>
-                              <w:r>
-                                <w:rPr>
-                                  <w:rFonts w:ascii="Times New Roman" w:hAnsi="Times New Roman"/>
-                                  <w:sz w:val="20"/>
-                                </w:rPr>
-                                <w:t>докум</w:t>
-                              </w:r>
-                              <w:proofErr w:type="spellEnd"/>
-                              <w:r>
-                                <w:rPr>
-                                  <w:rFonts w:ascii="Times New Roman" w:hAnsi="Times New Roman"/>
-                                  <w:sz w:val="20"/>
-                                </w:rPr>
-                                <w:t>.</w:t>
+                                <w:t>№ докум.</w:t>
                               </w:r>
                             </w:p>
                           </w:txbxContent>
@@ -1459,7 +1434,6 @@
                                   <w:sz w:val="20"/>
                                 </w:rPr>
                               </w:pPr>
-                              <w:proofErr w:type="spellStart"/>
                               <w:r>
                                 <w:rPr>
                                   <w:rFonts w:ascii="Times New Roman" w:hAnsi="Times New Roman"/>
@@ -1467,7 +1441,6 @@
                                 </w:rPr>
                                 <w:t>Подпись</w:t>
                               </w:r>
-                              <w:proofErr w:type="spellEnd"/>
                             </w:p>
                           </w:txbxContent>
                         </wps:txbx>
@@ -1970,23 +1943,7 @@
                                     <w:rFonts w:ascii="Times New Roman" w:hAnsi="Times New Roman"/>
                                     <w:sz w:val="20"/>
                                   </w:rPr>
-                                  <w:t xml:space="preserve"> </w:t>
-                                </w:r>
-                                <w:proofErr w:type="spellStart"/>
-                                <w:r>
-                                  <w:rPr>
-                                    <w:rFonts w:ascii="Times New Roman" w:hAnsi="Times New Roman"/>
-                                    <w:sz w:val="20"/>
-                                  </w:rPr>
-                                  <w:t>Разраб</w:t>
-                                </w:r>
-                                <w:proofErr w:type="spellEnd"/>
-                                <w:r>
-                                  <w:rPr>
-                                    <w:rFonts w:ascii="Times New Roman" w:hAnsi="Times New Roman"/>
-                                    <w:sz w:val="20"/>
-                                  </w:rPr>
-                                  <w:t>.</w:t>
+                                  <w:t xml:space="preserve"> Разраб.</w:t>
                                 </w:r>
                               </w:p>
                             </w:txbxContent>
@@ -2139,23 +2096,7 @@
                                     <w:rFonts w:ascii="Times New Roman" w:hAnsi="Times New Roman"/>
                                     <w:sz w:val="20"/>
                                   </w:rPr>
-                                  <w:t xml:space="preserve"> </w:t>
-                                </w:r>
-                                <w:proofErr w:type="spellStart"/>
-                                <w:r>
-                                  <w:rPr>
-                                    <w:rFonts w:ascii="Times New Roman" w:hAnsi="Times New Roman"/>
-                                    <w:sz w:val="20"/>
-                                  </w:rPr>
-                                  <w:t>Провер</w:t>
-                                </w:r>
-                                <w:proofErr w:type="spellEnd"/>
-                                <w:r>
-                                  <w:rPr>
-                                    <w:rFonts w:ascii="Times New Roman" w:hAnsi="Times New Roman"/>
-                                    <w:sz w:val="20"/>
-                                  </w:rPr>
-                                  <w:t>.</w:t>
+                                  <w:t xml:space="preserve"> Провер.</w:t>
                                 </w:r>
                               </w:p>
                             </w:txbxContent>
@@ -2297,21 +2238,12 @@
                                   </w:rPr>
                                   <w:t xml:space="preserve"> </w:t>
                                 </w:r>
-                                <w:proofErr w:type="spellStart"/>
                                 <w:r>
                                   <w:rPr>
                                     <w:rFonts w:ascii="Times New Roman" w:hAnsi="Times New Roman"/>
                                     <w:sz w:val="20"/>
                                   </w:rPr>
-                                  <w:t>Реценз</w:t>
-                                </w:r>
-                                <w:proofErr w:type="spellEnd"/>
-                                <w:r>
-                                  <w:rPr>
-                                    <w:rFonts w:ascii="Times New Roman" w:hAnsi="Times New Roman"/>
-                                    <w:sz w:val="20"/>
-                                  </w:rPr>
-                                  <w:t>.</w:t>
+                                  <w:t>Реценз.</w:t>
                                 </w:r>
                               </w:p>
                             </w:txbxContent>
@@ -2567,23 +2499,7 @@
                                     <w:rFonts w:ascii="Times New Roman" w:hAnsi="Times New Roman"/>
                                     <w:sz w:val="20"/>
                                   </w:rPr>
-                                  <w:t xml:space="preserve"> </w:t>
-                                </w:r>
-                                <w:proofErr w:type="spellStart"/>
-                                <w:r>
-                                  <w:rPr>
-                                    <w:rFonts w:ascii="Times New Roman" w:hAnsi="Times New Roman"/>
-                                    <w:sz w:val="20"/>
-                                  </w:rPr>
-                                  <w:t>Утверд</w:t>
-                                </w:r>
-                                <w:proofErr w:type="spellEnd"/>
-                                <w:r>
-                                  <w:rPr>
-                                    <w:rFonts w:ascii="Times New Roman" w:hAnsi="Times New Roman"/>
-                                    <w:sz w:val="20"/>
-                                  </w:rPr>
-                                  <w:t>.</w:t>
+                                  <w:t xml:space="preserve"> Утверд.</w:t>
                                 </w:r>
                               </w:p>
                             </w:txbxContent>
@@ -2894,21 +2810,12 @@
                                   <w:sz w:val="20"/>
                                 </w:rPr>
                               </w:pPr>
-                              <w:proofErr w:type="spellStart"/>
                               <w:r>
                                 <w:rPr>
                                   <w:rFonts w:ascii="Times New Roman" w:hAnsi="Times New Roman"/>
                                   <w:sz w:val="20"/>
                                 </w:rPr>
-                                <w:t>Лит</w:t>
-                              </w:r>
-                              <w:proofErr w:type="spellEnd"/>
-                              <w:r>
-                                <w:rPr>
-                                  <w:rFonts w:ascii="Times New Roman" w:hAnsi="Times New Roman"/>
-                                  <w:sz w:val="20"/>
-                                </w:rPr>
-                                <w:t>.</w:t>
+                                <w:t>Лит.</w:t>
                               </w:r>
                             </w:p>
                           </w:txbxContent>
@@ -3233,21 +3140,12 @@
                           </w:rPr>
                           <w:t>И</w:t>
                         </w:r>
-                        <w:proofErr w:type="spellStart"/>
                         <w:r>
                           <w:rPr>
                             <w:rFonts w:ascii="Times New Roman" w:hAnsi="Times New Roman"/>
                             <w:sz w:val="20"/>
                           </w:rPr>
-                          <w:t>зм</w:t>
-                        </w:r>
-                        <w:proofErr w:type="spellEnd"/>
-                        <w:r>
-                          <w:rPr>
-                            <w:rFonts w:ascii="Times New Roman" w:hAnsi="Times New Roman"/>
-                            <w:sz w:val="20"/>
-                          </w:rPr>
-                          <w:t>.</w:t>
+                          <w:t>зм.</w:t>
                         </w:r>
                       </w:p>
                     </w:txbxContent>
@@ -3293,23 +3191,7 @@
                             <w:rFonts w:ascii="Times New Roman" w:hAnsi="Times New Roman"/>
                             <w:sz w:val="20"/>
                           </w:rPr>
-                          <w:t xml:space="preserve">№ </w:t>
-                        </w:r>
-                        <w:proofErr w:type="spellStart"/>
-                        <w:r>
-                          <w:rPr>
-                            <w:rFonts w:ascii="Times New Roman" w:hAnsi="Times New Roman"/>
-                            <w:sz w:val="20"/>
-                          </w:rPr>
-                          <w:t>докум</w:t>
-                        </w:r>
-                        <w:proofErr w:type="spellEnd"/>
-                        <w:r>
-                          <w:rPr>
-                            <w:rFonts w:ascii="Times New Roman" w:hAnsi="Times New Roman"/>
-                            <w:sz w:val="20"/>
-                          </w:rPr>
-                          <w:t>.</w:t>
+                          <w:t>№ докум.</w:t>
                         </w:r>
                       </w:p>
                     </w:txbxContent>
@@ -3327,7 +3209,6 @@
                             <w:sz w:val="20"/>
                           </w:rPr>
                         </w:pPr>
-                        <w:proofErr w:type="spellStart"/>
                         <w:r>
                           <w:rPr>
                             <w:rFonts w:ascii="Times New Roman" w:hAnsi="Times New Roman"/>
@@ -3335,7 +3216,6 @@
                           </w:rPr>
                           <w:t>Подпись</w:t>
                         </w:r>
-                        <w:proofErr w:type="spellEnd"/>
                       </w:p>
                     </w:txbxContent>
                   </v:textbox>
@@ -3476,23 +3356,7 @@
                               <w:rFonts w:ascii="Times New Roman" w:hAnsi="Times New Roman"/>
                               <w:sz w:val="20"/>
                             </w:rPr>
-                            <w:t xml:space="preserve"> </w:t>
-                          </w:r>
-                          <w:proofErr w:type="spellStart"/>
-                          <w:r>
-                            <w:rPr>
-                              <w:rFonts w:ascii="Times New Roman" w:hAnsi="Times New Roman"/>
-                              <w:sz w:val="20"/>
-                            </w:rPr>
-                            <w:t>Разраб</w:t>
-                          </w:r>
-                          <w:proofErr w:type="spellEnd"/>
-                          <w:r>
-                            <w:rPr>
-                              <w:rFonts w:ascii="Times New Roman" w:hAnsi="Times New Roman"/>
-                              <w:sz w:val="20"/>
-                            </w:rPr>
-                            <w:t>.</w:t>
+                            <w:t xml:space="preserve"> Разраб.</w:t>
                           </w:r>
                         </w:p>
                       </w:txbxContent>
@@ -3555,23 +3419,7 @@
                               <w:rFonts w:ascii="Times New Roman" w:hAnsi="Times New Roman"/>
                               <w:sz w:val="20"/>
                             </w:rPr>
-                            <w:t xml:space="preserve"> </w:t>
-                          </w:r>
-                          <w:proofErr w:type="spellStart"/>
-                          <w:r>
-                            <w:rPr>
-                              <w:rFonts w:ascii="Times New Roman" w:hAnsi="Times New Roman"/>
-                              <w:sz w:val="20"/>
-                            </w:rPr>
-                            <w:t>Провер</w:t>
-                          </w:r>
-                          <w:proofErr w:type="spellEnd"/>
-                          <w:r>
-                            <w:rPr>
-                              <w:rFonts w:ascii="Times New Roman" w:hAnsi="Times New Roman"/>
-                              <w:sz w:val="20"/>
-                            </w:rPr>
-                            <w:t>.</w:t>
+                            <w:t xml:space="preserve"> Провер.</w:t>
                           </w:r>
                         </w:p>
                       </w:txbxContent>
@@ -3623,21 +3471,12 @@
                             </w:rPr>
                             <w:t xml:space="preserve"> </w:t>
                           </w:r>
-                          <w:proofErr w:type="spellStart"/>
                           <w:r>
                             <w:rPr>
                               <w:rFonts w:ascii="Times New Roman" w:hAnsi="Times New Roman"/>
                               <w:sz w:val="20"/>
                             </w:rPr>
-                            <w:t>Реценз</w:t>
-                          </w:r>
-                          <w:proofErr w:type="spellEnd"/>
-                          <w:r>
-                            <w:rPr>
-                              <w:rFonts w:ascii="Times New Roman" w:hAnsi="Times New Roman"/>
-                              <w:sz w:val="20"/>
-                            </w:rPr>
-                            <w:t>.</w:t>
+                            <w:t>Реценз.</w:t>
                           </w:r>
                         </w:p>
                       </w:txbxContent>
@@ -3713,23 +3552,7 @@
                               <w:rFonts w:ascii="Times New Roman" w:hAnsi="Times New Roman"/>
                               <w:sz w:val="20"/>
                             </w:rPr>
-                            <w:t xml:space="preserve"> </w:t>
-                          </w:r>
-                          <w:proofErr w:type="spellStart"/>
-                          <w:r>
-                            <w:rPr>
-                              <w:rFonts w:ascii="Times New Roman" w:hAnsi="Times New Roman"/>
-                              <w:sz w:val="20"/>
-                            </w:rPr>
-                            <w:t>Утверд</w:t>
-                          </w:r>
-                          <w:proofErr w:type="spellEnd"/>
-                          <w:r>
-                            <w:rPr>
-                              <w:rFonts w:ascii="Times New Roman" w:hAnsi="Times New Roman"/>
-                              <w:sz w:val="20"/>
-                            </w:rPr>
-                            <w:t>.</w:t>
+                            <w:t xml:space="preserve"> Утверд.</w:t>
                           </w:r>
                         </w:p>
                       </w:txbxContent>
@@ -3799,21 +3622,12 @@
                             <w:sz w:val="20"/>
                           </w:rPr>
                         </w:pPr>
-                        <w:proofErr w:type="spellStart"/>
                         <w:r>
                           <w:rPr>
                             <w:rFonts w:ascii="Times New Roman" w:hAnsi="Times New Roman"/>
                             <w:sz w:val="20"/>
                           </w:rPr>
-                          <w:t>Лит</w:t>
-                        </w:r>
-                        <w:proofErr w:type="spellEnd"/>
-                        <w:r>
-                          <w:rPr>
-                            <w:rFonts w:ascii="Times New Roman" w:hAnsi="Times New Roman"/>
-                            <w:sz w:val="20"/>
-                          </w:rPr>
-                          <w:t>.</w:t>
+                          <w:t>Лит.</w:t>
                         </w:r>
                       </w:p>
                     </w:txbxContent>
@@ -4176,15 +3990,7 @@
         </w:rPr>
       </w:pPr>
       <w:r>
-        <w:t xml:space="preserve">Проект представляет собой сетевое веб-приложение с отдельной клиентской частью и </w:t>
-      </w:r>
-      <w:proofErr w:type="spellStart"/>
-      <w:r>
-        <w:t>backend</w:t>
-      </w:r>
-      <w:proofErr w:type="spellEnd"/>
-      <w:r>
-        <w:t>-модулем, который собирается как исполняемый Spring Boot JAR. Выбор конкретных инструментов продиктован необходимостью обеспечения целостности данных, удобства поддержки кода и автоматизации процессов сборки.</w:t>
+        <w:t>Проект представляет собой сетевое веб-приложение с отдельной клиентской частью и backend-модулем, который собирается как исполняемый Spring Boot JAR. Выбор конкретных инструментов продиктован необходимостью обеспечения целостности данных, удобства поддержки кода и автоматизации процессов сборки.</w:t>
       </w:r>
     </w:p>
     <w:p>
@@ -4225,30 +4031,46 @@
         <w:ind w:firstLine="567"/>
         <w:jc w:val="both"/>
       </w:pPr>
-      <w:proofErr w:type="spellStart"/>
       <w:r>
         <w:rPr>
           <w:b/>
         </w:rPr>
-        <w:t>IntelliJ</w:t>
-      </w:r>
-      <w:proofErr w:type="spellEnd"/>
+        <w:t xml:space="preserve">IntelliJ IDEA — </w:t>
+      </w:r>
+      <w:r>
+        <w:t>интегрированная среда разработки (IDE) от JetBrains.</w:t>
+      </w:r>
+    </w:p>
+    <w:p>
+      <w:pPr>
+        <w:spacing w:after="0"/>
+        <w:ind w:firstLine="567"/>
+        <w:jc w:val="both"/>
+      </w:pPr>
+      <w:r>
+        <w:rPr>
+          <w:i/>
+        </w:rPr>
+        <w:t>- Обоснование выбора:</w:t>
+      </w:r>
+      <w:r>
+        <w:t xml:space="preserve"> Использование IntelliJ IDEA обусловлено наличием продвинутых инструментов статического анализа кода, рефакторинга и отладки. Это ускоряет разработку сложных модулей и помогает поддерживать высокое качество исходного кода.</w:t>
+      </w:r>
+    </w:p>
+    <w:p>
+      <w:pPr>
+        <w:spacing w:after="0"/>
+        <w:ind w:firstLine="567"/>
+        <w:jc w:val="both"/>
+      </w:pPr>
       <w:r>
         <w:rPr>
           <w:b/>
         </w:rPr>
-        <w:t xml:space="preserve"> IDEA — </w:t>
-      </w:r>
-      <w:r>
-        <w:t xml:space="preserve">интегрированная среда разработки (IDE) от </w:t>
-      </w:r>
-      <w:proofErr w:type="spellStart"/>
-      <w:r>
-        <w:t>JetBrains</w:t>
-      </w:r>
-      <w:proofErr w:type="spellEnd"/>
-      <w:r>
-        <w:t>.</w:t>
+        <w:t xml:space="preserve">Spring Boot — </w:t>
+      </w:r>
+      <w:r>
+        <w:t>фреймворк для создания серверной части веб-приложения и REST API.</w:t>
       </w:r>
     </w:p>
     <w:p>
@@ -4264,15 +4086,7 @@
         <w:t>- Обоснование выбора:</w:t>
       </w:r>
       <w:r>
-        <w:t xml:space="preserve"> Использование </w:t>
-      </w:r>
-      <w:proofErr w:type="spellStart"/>
-      <w:r>
-        <w:t>IntelliJ</w:t>
-      </w:r>
-      <w:proofErr w:type="spellEnd"/>
-      <w:r>
-        <w:t xml:space="preserve"> IDEA обусловлено наличием продвинутых инструментов статического анализа кода, рефакторинга и отладки. Это ускоряет разработку сложных модулей и помогает поддерживать высокое качество исходного кода.</w:t>
+        <w:t xml:space="preserve"> Выбор в пользу Spring Boot сделан для обеспечения переносимой серверной архитектуры, удобной обработки HTTP-запросов, маршрутизации, валидации и конфигурации безопасности.</w:t>
       </w:r>
     </w:p>
     <w:p>
@@ -4285,10 +4099,11 @@
         <w:rPr>
           <w:b/>
         </w:rPr>
-        <w:t xml:space="preserve">Spring Boot — </w:t>
-      </w:r>
-      <w:r>
-        <w:t>фреймворк для создания серверной части веб-приложения и REST API.</w:t>
+        <w:lastRenderedPageBreak/>
+        <w:t xml:space="preserve">React — </w:t>
+      </w:r>
+      <w:r>
+        <w:t>компонентная библиотека для построения пользовательского интерфейса.</w:t>
       </w:r>
     </w:p>
     <w:p>
@@ -4304,32 +4119,55 @@
         <w:t>- Обоснование выбора:</w:t>
       </w:r>
       <w:r>
-        <w:t xml:space="preserve"> Выбор в пользу Spring Boot сделан для обеспечения переносимой серверной архитектуры, удобной обработки HTTP-запросов, маршрутизации, валидации и конфигурации безопасности.</w:t>
-      </w:r>
-    </w:p>
-    <w:p>
-      <w:pPr>
-        <w:spacing w:after="0"/>
-        <w:ind w:firstLine="567"/>
-        <w:jc w:val="both"/>
-      </w:pPr>
-      <w:proofErr w:type="spellStart"/>
+        <w:t xml:space="preserve"> React выбран для реализации уровня представления с целью соблюдения принципа разделения ответственности. Компонентный подход позволяет избежать дублирования разметки и сделать интерфейсы ролей более поддерживаемыми.</w:t>
+      </w:r>
+    </w:p>
+    <w:p>
+      <w:pPr>
+        <w:spacing w:after="0"/>
+        <w:ind w:firstLine="567"/>
+        <w:jc w:val="both"/>
+      </w:pPr>
       <w:r>
         <w:rPr>
           <w:b/>
         </w:rPr>
-        <w:lastRenderedPageBreak/>
-        <w:t>React</w:t>
-      </w:r>
-      <w:proofErr w:type="spellEnd"/>
+        <w:t xml:space="preserve">Maven — </w:t>
+      </w:r>
+      <w:r>
+        <w:t>инструмент управления проектами и сборки.</w:t>
+      </w:r>
+    </w:p>
+    <w:p>
+      <w:pPr>
+        <w:spacing w:after="0"/>
+        <w:ind w:firstLine="567"/>
+        <w:jc w:val="both"/>
+      </w:pPr>
+      <w:r>
+        <w:rPr>
+          <w:i/>
+        </w:rPr>
+        <w:t>- Обоснование выбора:</w:t>
+      </w:r>
+      <w:r>
+        <w:t xml:space="preserve"> Maven используется для автоматизации процесса сборки backend-модуля и управления зависимостями. Это гарантирует воспроизводимость сборки на любом компьютере разработчика и упрощает подключение необходимых библиотек без конфликтов версий.</w:t>
+      </w:r>
+    </w:p>
+    <w:p>
+      <w:pPr>
+        <w:spacing w:after="0"/>
+        <w:ind w:firstLine="567"/>
+        <w:jc w:val="both"/>
+      </w:pPr>
       <w:r>
         <w:rPr>
           <w:b/>
         </w:rPr>
-        <w:t xml:space="preserve"> — </w:t>
-      </w:r>
-      <w:r>
-        <w:t>компонентная библиотека для построения пользовательского интерфейса.</w:t>
+        <w:t xml:space="preserve">PostgreSQL — </w:t>
+      </w:r>
+      <w:r>
+        <w:t>объектно-реляционная СУБД с открытым исходным кодом.</w:t>
       </w:r>
     </w:p>
     <w:p>
@@ -4345,145 +4183,33 @@
         <w:t>- Обоснование выбора:</w:t>
       </w:r>
       <w:r>
-        <w:t xml:space="preserve"> </w:t>
-      </w:r>
-      <w:proofErr w:type="spellStart"/>
-      <w:r>
-        <w:t>React</w:t>
-      </w:r>
-      <w:proofErr w:type="spellEnd"/>
-      <w:r>
-        <w:t xml:space="preserve"> выбран для реализации уровня представления с целью соблюдения принципа разделения ответственности. Компонентный подход позволяет избежать дублирования разметки и сделать интерфейсы ролей более поддерживаемыми.</w:t>
-      </w:r>
-    </w:p>
-    <w:p>
-      <w:pPr>
-        <w:spacing w:after="0"/>
-        <w:ind w:firstLine="567"/>
-        <w:jc w:val="both"/>
-      </w:pPr>
-      <w:proofErr w:type="spellStart"/>
-      <w:r>
+        <w:t xml:space="preserve"> Для хранения данных проекта выбрана PostgreSQL, поскольку она поддерживает свойства ACID, надёжную работу с конкурентными операциями и удобные выборки по каталогу, пользователям, заказам и маршрутам доставки.</w:t>
+      </w:r>
+    </w:p>
+    <w:p>
+      <w:pPr>
+        <w:spacing w:after="0"/>
+        <w:ind w:firstLine="567"/>
+        <w:jc w:val="both"/>
+        <w:rPr>
+          <w:rFonts w:cs="Times New Roman"/>
+          <w:szCs w:val="28"/>
+        </w:rPr>
+      </w:pPr>
+    </w:p>
+    <w:p>
+      <w:pPr>
+        <w:spacing w:after="0"/>
+        <w:ind w:firstLine="567"/>
+        <w:jc w:val="both"/>
         <w:rPr>
           <w:b/>
         </w:rPr>
-        <w:t>Maven</w:t>
-      </w:r>
-      <w:proofErr w:type="spellEnd"/>
+      </w:pPr>
       <w:r>
         <w:rPr>
           <w:b/>
         </w:rPr>
-        <w:t xml:space="preserve"> — </w:t>
-      </w:r>
-      <w:r>
-        <w:t>инструмент управления проектами и сборки.</w:t>
-      </w:r>
-    </w:p>
-    <w:p>
-      <w:pPr>
-        <w:spacing w:after="0"/>
-        <w:ind w:firstLine="567"/>
-        <w:jc w:val="both"/>
-      </w:pPr>
-      <w:r>
-        <w:rPr>
-          <w:i/>
-        </w:rPr>
-        <w:t>- Обоснование выбора:</w:t>
-      </w:r>
-      <w:r>
-        <w:t xml:space="preserve"> </w:t>
-      </w:r>
-      <w:proofErr w:type="spellStart"/>
-      <w:r>
-        <w:t>Maven</w:t>
-      </w:r>
-      <w:proofErr w:type="spellEnd"/>
-      <w:r>
-        <w:t xml:space="preserve"> используется для автоматизации процесса сборки </w:t>
-      </w:r>
-      <w:proofErr w:type="spellStart"/>
-      <w:r>
-        <w:t>backend</w:t>
-      </w:r>
-      <w:proofErr w:type="spellEnd"/>
-      <w:r>
-        <w:t>-модуля и управления зависимостями. Это гарантирует воспроизводимость сборки на любом компьютере разработчика и упрощает подключение необходимых библиотек без конфликтов версий.</w:t>
-      </w:r>
-    </w:p>
-    <w:p>
-      <w:pPr>
-        <w:spacing w:after="0"/>
-        <w:ind w:firstLine="567"/>
-        <w:jc w:val="both"/>
-      </w:pPr>
-      <w:proofErr w:type="spellStart"/>
-      <w:r>
-        <w:rPr>
-          <w:b/>
-        </w:rPr>
-        <w:t>PostgreSQL</w:t>
-      </w:r>
-      <w:proofErr w:type="spellEnd"/>
-      <w:r>
-        <w:rPr>
-          <w:b/>
-        </w:rPr>
-        <w:t xml:space="preserve"> — </w:t>
-      </w:r>
-      <w:r>
-        <w:t>объектно-реляционная СУБД с открытым исходным кодом.</w:t>
-      </w:r>
-    </w:p>
-    <w:p>
-      <w:pPr>
-        <w:spacing w:after="0"/>
-        <w:ind w:firstLine="567"/>
-        <w:jc w:val="both"/>
-      </w:pPr>
-      <w:r>
-        <w:rPr>
-          <w:i/>
-        </w:rPr>
-        <w:t>- Обоснование выбора:</w:t>
-      </w:r>
-      <w:r>
-        <w:t xml:space="preserve"> Для хранения данных проекта выбрана </w:t>
-      </w:r>
-      <w:proofErr w:type="spellStart"/>
-      <w:r>
-        <w:t>PostgreSQL</w:t>
-      </w:r>
-      <w:proofErr w:type="spellEnd"/>
-      <w:r>
-        <w:t>, поскольку она поддерживает свойства ACID, надёжную работу с конкурентными операциями и удобные выборки по каталогу, пользователям, заказам и маршрутам доставки.</w:t>
-      </w:r>
-    </w:p>
-    <w:p>
-      <w:pPr>
-        <w:spacing w:after="0"/>
-        <w:ind w:firstLine="567"/>
-        <w:jc w:val="both"/>
-        <w:rPr>
-          <w:rFonts w:cs="Times New Roman"/>
-          <w:szCs w:val="28"/>
-        </w:rPr>
-      </w:pPr>
-    </w:p>
-    <w:p>
-      <w:pPr>
-        <w:spacing w:after="0"/>
-        <w:ind w:firstLine="567"/>
-        <w:jc w:val="both"/>
-        <w:rPr>
-          <w:b/>
-        </w:rPr>
-      </w:pPr>
-      <w:r>
-        <w:rPr>
-          <w:b/>
-        </w:rPr>
         <w:t>1.3 Постановка задачи</w:t>
       </w:r>
     </w:p>
@@ -4568,37 +4294,20 @@
         </w:rPr>
       </w:pPr>
       <w:r>
-        <w:t xml:space="preserve">Использовать Java и JavaScript в разработке серверной и клиентской частей приложения, а также среду разработки </w:t>
-      </w:r>
-      <w:proofErr w:type="spellStart"/>
-      <w:r>
-        <w:t>IntelliJ</w:t>
-      </w:r>
-      <w:proofErr w:type="spellEnd"/>
-      <w:r>
-        <w:t xml:space="preserve"> IDEA для создания, тестирования и отладки кода. Для визуальной составляющей использовать </w:t>
-      </w:r>
-      <w:proofErr w:type="spellStart"/>
-      <w:r>
-        <w:t>React</w:t>
-      </w:r>
-      <w:proofErr w:type="spellEnd"/>
-      <w:r>
-        <w:t>, CSS и JavaScript.</w:t>
-      </w:r>
-    </w:p>
-    <w:p>
-      <w:pPr>
-        <w:spacing w:after="0"/>
-        <w:ind w:firstLine="567"/>
-        <w:jc w:val="both"/>
-        <w:rPr>
-          <w:rFonts w:cs="Times New Roman"/>
-          <w:szCs w:val="28"/>
-        </w:rPr>
-      </w:pPr>
-      <w:r>
-        <w:lastRenderedPageBreak/>
+        <w:t>Использовать Java и JavaScript в разработке серверной и клиентской частей приложения, а также среду разработки IntelliJ IDEA для создания, тестирования и отладки кода. Для визуальной составляющей использовать React, CSS и JavaScript.</w:t>
+      </w:r>
+    </w:p>
+    <w:p>
+      <w:pPr>
+        <w:spacing w:after="0"/>
+        <w:ind w:firstLine="567"/>
+        <w:jc w:val="both"/>
+        <w:rPr>
+          <w:rFonts w:cs="Times New Roman"/>
+          <w:szCs w:val="28"/>
+        </w:rPr>
+      </w:pPr>
+      <w:r>
         <w:t>Решение поставленных задач позволит создать приложение, которое оптимизирует процесс оформления и доставки заказов, улучшит координацию между сотрудниками фермерского хозяйства и повысит общую эффективность работы отдела сбыта.</w:t>
       </w:r>
     </w:p>
@@ -4613,37 +4322,21 @@
         </w:rPr>
       </w:pPr>
       <w:r>
-        <w:t xml:space="preserve">Требования к оборудованию и программному обеспечению для разработчика, использующего </w:t>
-      </w:r>
-      <w:proofErr w:type="spellStart"/>
-      <w:r>
-        <w:t>IntelliJ</w:t>
-      </w:r>
-      <w:proofErr w:type="spellEnd"/>
-      <w:r>
-        <w:t xml:space="preserve"> IDEA 2025.3, включают:</w:t>
-      </w:r>
-    </w:p>
-    <w:p>
-      <w:pPr>
-        <w:spacing w:after="0"/>
-        <w:ind w:firstLine="567"/>
-        <w:jc w:val="both"/>
-        <w:rPr>
-          <w:rFonts w:cs="Times New Roman"/>
-          <w:szCs w:val="28"/>
-        </w:rPr>
-      </w:pPr>
-      <w:r>
-        <w:t xml:space="preserve">Процессор не ниже AMD </w:t>
-      </w:r>
-      <w:proofErr w:type="spellStart"/>
-      <w:r>
-        <w:t>Ryzen</w:t>
-      </w:r>
-      <w:proofErr w:type="spellEnd"/>
-      <w:r>
-        <w:t xml:space="preserve"> 3 или аналогичный. Оперативная память минимум 8 ГБ, SSD-накопитель для быстрой работы с проектом и экран с разрешением не ниже 1920×1080 обеспечат удобную разработку и показ публичной версии системы.</w:t>
+        <w:t>Требования к оборудованию и программному обеспечению для разработчика, использующего IntelliJ IDEA 2025.3, включают:</w:t>
+      </w:r>
+    </w:p>
+    <w:p>
+      <w:pPr>
+        <w:spacing w:after="0"/>
+        <w:ind w:firstLine="567"/>
+        <w:jc w:val="both"/>
+        <w:rPr>
+          <w:rFonts w:cs="Times New Roman"/>
+          <w:szCs w:val="28"/>
+        </w:rPr>
+      </w:pPr>
+      <w:r>
+        <w:t>Процессор не ниже AMD Ryzen 3 или аналогичный. Оперативная память минимум 8 ГБ, SSD-накопитель для быстрой работы с проектом и экран с разрешением не ниже 1920×1080 обеспечат удобную разработку и показ публичной версии системы.</w:t>
       </w:r>
     </w:p>
     <w:p>
@@ -4685,23 +4378,7 @@
         </w:rPr>
       </w:pPr>
       <w:r>
-        <w:t xml:space="preserve">Для сопровождения и повторного развёртывания приложения требуется поддержка JDK 21, Node.js 20, доступ к репозиторию и настроенным переменным окружения </w:t>
-      </w:r>
-      <w:proofErr w:type="spellStart"/>
-      <w:r>
-        <w:t>backend</w:t>
-      </w:r>
-      <w:proofErr w:type="spellEnd"/>
-      <w:r>
-        <w:t xml:space="preserve"> и </w:t>
-      </w:r>
-      <w:proofErr w:type="spellStart"/>
-      <w:r>
-        <w:t>frontend</w:t>
-      </w:r>
-      <w:proofErr w:type="spellEnd"/>
-      <w:r>
-        <w:t>-сервисов.</w:t>
+        <w:t>Для сопровождения и повторного развёртывания приложения требуется поддержка JDK 21, Node.js 20, доступ к репозиторию и настроенным переменным окружения backend и frontend-сервисов.</w:t>
       </w:r>
     </w:p>
     <w:p>
@@ -4743,15 +4420,7 @@
         </w:rPr>
       </w:pPr>
       <w:r>
-        <w:t xml:space="preserve">Требования к браузеру включают использование последних версий Google </w:t>
-      </w:r>
-      <w:proofErr w:type="spellStart"/>
-      <w:r>
-        <w:t>Chrome</w:t>
-      </w:r>
-      <w:proofErr w:type="spellEnd"/>
-      <w:r>
-        <w:t>, Microsoft Edge, Mozilla Firefox или других совместимых решений. Это обеспечивает корректное отображение интерфейса, карт, таблиц и пользовательских форм.</w:t>
+        <w:t>Требования к браузеру включают использование последних версий Google Chrome, Microsoft Edge, Mozilla Firefox или других совместимых решений. Это обеспечивает корректное отображение интерфейса, карт, таблиц и пользовательских форм.</w:t>
       </w:r>
     </w:p>
     <w:p>
@@ -4839,15 +4508,7 @@
         </w:rPr>
       </w:pPr>
       <w:r>
-        <w:t xml:space="preserve">Создать в базе данных таблицы </w:t>
-      </w:r>
-      <w:proofErr w:type="spellStart"/>
-      <w:r>
-        <w:t>PostgreSQL</w:t>
-      </w:r>
-      <w:proofErr w:type="spellEnd"/>
-      <w:r>
-        <w:t>:</w:t>
+        <w:t>Создать в базе данных таблицы PostgreSQL:</w:t>
       </w:r>
     </w:p>
     <w:p>
@@ -4870,15 +4531,7 @@
         </w:rPr>
       </w:pPr>
       <w:r>
-        <w:t xml:space="preserve">Создать в базе данных таблицу </w:t>
-      </w:r>
-      <w:proofErr w:type="spellStart"/>
-      <w:r>
-        <w:t>users</w:t>
-      </w:r>
-      <w:proofErr w:type="spellEnd"/>
-      <w:r>
-        <w:t>;</w:t>
+        <w:t>Создать в базе данных таблицу users;</w:t>
       </w:r>
     </w:p>
     <w:p>
@@ -4901,15 +4554,7 @@
         </w:rPr>
       </w:pPr>
       <w:r>
-        <w:t xml:space="preserve">Создать в базе данных таблицу </w:t>
-      </w:r>
-      <w:proofErr w:type="spellStart"/>
-      <w:r>
-        <w:t>store_addresses</w:t>
-      </w:r>
-      <w:proofErr w:type="spellEnd"/>
-      <w:r>
-        <w:t>;</w:t>
+        <w:t>Создать в базе данных таблицу store_addresses;</w:t>
       </w:r>
     </w:p>
     <w:p>
@@ -4932,15 +4577,7 @@
         </w:rPr>
       </w:pPr>
       <w:r>
-        <w:t xml:space="preserve">Создать в базе данных таблицу </w:t>
-      </w:r>
-      <w:proofErr w:type="spellStart"/>
-      <w:r>
-        <w:t>products</w:t>
-      </w:r>
-      <w:proofErr w:type="spellEnd"/>
-      <w:r>
-        <w:t>;</w:t>
+        <w:t>Создать в базе данных таблицу products;</w:t>
       </w:r>
     </w:p>
     <w:p>
@@ -4963,15 +4600,7 @@
         </w:rPr>
       </w:pPr>
       <w:r>
-        <w:t xml:space="preserve">Создать в базе данных таблицу </w:t>
-      </w:r>
-      <w:proofErr w:type="spellStart"/>
-      <w:r>
-        <w:t>orders</w:t>
-      </w:r>
-      <w:proofErr w:type="spellEnd"/>
-      <w:r>
-        <w:t>;</w:t>
+        <w:t>Создать в базе данных таблицу orders;</w:t>
       </w:r>
     </w:p>
     <w:p>
@@ -4994,16 +4623,7 @@
         </w:rPr>
       </w:pPr>
       <w:r>
-        <w:lastRenderedPageBreak/>
-        <w:t xml:space="preserve">Создать в базе данных таблицу </w:t>
-      </w:r>
-      <w:proofErr w:type="spellStart"/>
-      <w:r>
-        <w:t>order_items</w:t>
-      </w:r>
-      <w:proofErr w:type="spellEnd"/>
-      <w:r>
-        <w:t>;</w:t>
+        <w:t>Создать в базе данных таблицу order_items;</w:t>
       </w:r>
     </w:p>
     <w:p>
@@ -5042,58 +4662,16 @@
         <w:rPr>
           <w:lang w:val="en-US"/>
         </w:rPr>
-        <w:t xml:space="preserve"> </w:t>
-      </w:r>
-      <w:proofErr w:type="spellStart"/>
+        <w:t xml:space="preserve"> stock_movements, order_timeline_events </w:t>
+      </w:r>
+      <w:r>
+        <w:t>и</w:t>
+      </w:r>
       <w:r>
         <w:rPr>
           <w:lang w:val="en-US"/>
         </w:rPr>
-        <w:t>stock_movements</w:t>
-      </w:r>
-      <w:proofErr w:type="spellEnd"/>
-      <w:r>
-        <w:rPr>
-          <w:lang w:val="en-US"/>
-        </w:rPr>
-        <w:t xml:space="preserve">, </w:t>
-      </w:r>
-      <w:proofErr w:type="spellStart"/>
-      <w:r>
-        <w:rPr>
-          <w:lang w:val="en-US"/>
-        </w:rPr>
-        <w:t>order_timeline_events</w:t>
-      </w:r>
-      <w:proofErr w:type="spellEnd"/>
-      <w:r>
-        <w:rPr>
-          <w:lang w:val="en-US"/>
-        </w:rPr>
-        <w:t xml:space="preserve"> </w:t>
-      </w:r>
-      <w:r>
-        <w:t>и</w:t>
-      </w:r>
-      <w:r>
-        <w:rPr>
-          <w:lang w:val="en-US"/>
-        </w:rPr>
-        <w:t xml:space="preserve"> </w:t>
-      </w:r>
-      <w:proofErr w:type="spellStart"/>
-      <w:r>
-        <w:rPr>
-          <w:lang w:val="en-US"/>
-        </w:rPr>
-        <w:t>realtime_notifications</w:t>
-      </w:r>
-      <w:proofErr w:type="spellEnd"/>
-      <w:r>
-        <w:rPr>
-          <w:lang w:val="en-US"/>
-        </w:rPr>
-        <w:t>.</w:t>
+        <w:t xml:space="preserve"> realtime_notifications.</w:t>
       </w:r>
     </w:p>
     <w:p>
@@ -5139,23 +4717,7 @@
         </w:rPr>
       </w:pPr>
       <w:r>
-        <w:t xml:space="preserve">Создать проект Spring Boot и настроить </w:t>
-      </w:r>
-      <w:proofErr w:type="spellStart"/>
-      <w:r>
-        <w:t>Maven</w:t>
-      </w:r>
-      <w:proofErr w:type="spellEnd"/>
-      <w:r>
-        <w:t xml:space="preserve">, </w:t>
-      </w:r>
-      <w:proofErr w:type="spellStart"/>
-      <w:r>
-        <w:t>profiles</w:t>
-      </w:r>
-      <w:proofErr w:type="spellEnd"/>
-      <w:r>
-        <w:t xml:space="preserve"> и pom.xml;</w:t>
+        <w:t>Создать проект Spring Boot и настроить Maven, profiles и pom.xml;</w:t>
       </w:r>
     </w:p>
     <w:p>
@@ -5198,63 +4760,7 @@
         <w:rPr>
           <w:lang w:val="en-US"/>
         </w:rPr>
-        <w:t xml:space="preserve"> model: User, </w:t>
-      </w:r>
-      <w:proofErr w:type="spellStart"/>
-      <w:r>
-        <w:rPr>
-          <w:lang w:val="en-US"/>
-        </w:rPr>
-        <w:t>StoreAddress</w:t>
-      </w:r>
-      <w:proofErr w:type="spellEnd"/>
-      <w:r>
-        <w:rPr>
-          <w:lang w:val="en-US"/>
-        </w:rPr>
-        <w:t xml:space="preserve">, Product, Order, </w:t>
-      </w:r>
-      <w:proofErr w:type="spellStart"/>
-      <w:r>
-        <w:rPr>
-          <w:lang w:val="en-US"/>
-        </w:rPr>
-        <w:t>OrderItem</w:t>
-      </w:r>
-      <w:proofErr w:type="spellEnd"/>
-      <w:r>
-        <w:rPr>
-          <w:lang w:val="en-US"/>
-        </w:rPr>
-        <w:t xml:space="preserve">, </w:t>
-      </w:r>
-      <w:proofErr w:type="spellStart"/>
-      <w:r>
-        <w:rPr>
-          <w:lang w:val="en-US"/>
-        </w:rPr>
-        <w:t>OrderTimelineEvent</w:t>
-      </w:r>
-      <w:proofErr w:type="spellEnd"/>
-      <w:r>
-        <w:rPr>
-          <w:lang w:val="en-US"/>
-        </w:rPr>
-        <w:t xml:space="preserve">, </w:t>
-      </w:r>
-      <w:proofErr w:type="spellStart"/>
-      <w:r>
-        <w:rPr>
-          <w:lang w:val="en-US"/>
-        </w:rPr>
-        <w:t>RealtimeNotification</w:t>
-      </w:r>
-      <w:proofErr w:type="spellEnd"/>
-      <w:r>
-        <w:rPr>
-          <w:lang w:val="en-US"/>
-        </w:rPr>
-        <w:t>;</w:t>
+        <w:t xml:space="preserve"> model: User, StoreAddress, Product, Order, OrderItem, OrderTimelineEvent, RealtimeNotification;</w:t>
       </w:r>
     </w:p>
     <w:p>
@@ -5280,15 +4786,7 @@
         </w:rPr>
       </w:pPr>
       <w:r>
-        <w:t xml:space="preserve">Реализовать слой </w:t>
-      </w:r>
-      <w:proofErr w:type="spellStart"/>
-      <w:r>
-        <w:t>repository</w:t>
-      </w:r>
-      <w:proofErr w:type="spellEnd"/>
-      <w:r>
-        <w:t xml:space="preserve"> и миграции схемы базы данных;</w:t>
+        <w:t>Реализовать слой repository и миграции схемы базы данных;</w:t>
       </w:r>
     </w:p>
     <w:p>
@@ -5311,15 +4809,7 @@
         </w:rPr>
       </w:pPr>
       <w:r>
-        <w:t xml:space="preserve">Реализовать </w:t>
-      </w:r>
-      <w:proofErr w:type="spellStart"/>
-      <w:r>
-        <w:t>security</w:t>
-      </w:r>
-      <w:proofErr w:type="spellEnd"/>
-      <w:r>
-        <w:t>, JWT-аутентификацию и правила доступа;</w:t>
+        <w:t>Реализовать security, JWT-аутентификацию и правила доступа;</w:t>
       </w:r>
     </w:p>
     <w:p>
@@ -5345,23 +4835,7 @@
         </w:rPr>
       </w:pPr>
       <w:r>
-        <w:t xml:space="preserve">Реализовать </w:t>
-      </w:r>
-      <w:proofErr w:type="spellStart"/>
-      <w:r>
-        <w:t>AuthController</w:t>
-      </w:r>
-      <w:proofErr w:type="spellEnd"/>
-      <w:r>
-        <w:t xml:space="preserve"> и </w:t>
-      </w:r>
-      <w:proofErr w:type="spellStart"/>
-      <w:r>
-        <w:t>production</w:t>
-      </w:r>
-      <w:proofErr w:type="spellEnd"/>
-      <w:r>
-        <w:t>-настройки JWT-аутентификации;</w:t>
+        <w:t>Реализовать AuthController и production-настройки JWT-аутентификации;</w:t>
       </w:r>
     </w:p>
     <w:p>
@@ -5394,58 +4868,16 @@
         <w:rPr>
           <w:lang w:val="en-US"/>
         </w:rPr>
-        <w:t xml:space="preserve"> </w:t>
-      </w:r>
-      <w:proofErr w:type="spellStart"/>
+        <w:t xml:space="preserve"> GeoController, NotificationController </w:t>
+      </w:r>
+      <w:r>
+        <w:t>и</w:t>
+      </w:r>
       <w:r>
         <w:rPr>
           <w:lang w:val="en-US"/>
         </w:rPr>
-        <w:t>GeoController</w:t>
-      </w:r>
-      <w:proofErr w:type="spellEnd"/>
-      <w:r>
-        <w:rPr>
-          <w:lang w:val="en-US"/>
-        </w:rPr>
-        <w:t xml:space="preserve">, </w:t>
-      </w:r>
-      <w:proofErr w:type="spellStart"/>
-      <w:r>
-        <w:rPr>
-          <w:lang w:val="en-US"/>
-        </w:rPr>
-        <w:t>NotificationController</w:t>
-      </w:r>
-      <w:proofErr w:type="spellEnd"/>
-      <w:r>
-        <w:rPr>
-          <w:lang w:val="en-US"/>
-        </w:rPr>
-        <w:t xml:space="preserve"> </w:t>
-      </w:r>
-      <w:r>
-        <w:t>и</w:t>
-      </w:r>
-      <w:r>
-        <w:rPr>
-          <w:lang w:val="en-US"/>
-        </w:rPr>
-        <w:t xml:space="preserve"> </w:t>
-      </w:r>
-      <w:proofErr w:type="spellStart"/>
-      <w:r>
-        <w:rPr>
-          <w:lang w:val="en-US"/>
-        </w:rPr>
-        <w:t>DashboardController</w:t>
-      </w:r>
-      <w:proofErr w:type="spellEnd"/>
-      <w:r>
-        <w:rPr>
-          <w:lang w:val="en-US"/>
-        </w:rPr>
-        <w:t>;</w:t>
+        <w:t xml:space="preserve"> DashboardController;</w:t>
       </w:r>
     </w:p>
     <w:p>
@@ -5471,15 +4903,7 @@
         </w:rPr>
       </w:pPr>
       <w:r>
-        <w:t xml:space="preserve">Реализовать </w:t>
-      </w:r>
-      <w:proofErr w:type="spellStart"/>
-      <w:r>
-        <w:t>OrderController</w:t>
-      </w:r>
-      <w:proofErr w:type="spellEnd"/>
-      <w:r>
-        <w:t xml:space="preserve"> для ручного и автоматического назначения маршрутов;</w:t>
+        <w:t>Реализовать OrderController для ручного и автоматического назначения маршрутов;</w:t>
       </w:r>
     </w:p>
     <w:p>
@@ -5512,58 +4936,16 @@
         <w:rPr>
           <w:lang w:val="en-US"/>
         </w:rPr>
-        <w:t xml:space="preserve"> </w:t>
-      </w:r>
-      <w:proofErr w:type="spellStart"/>
+        <w:t xml:space="preserve"> ProductController, UserManagementController </w:t>
+      </w:r>
+      <w:r>
+        <w:t>и</w:t>
+      </w:r>
       <w:r>
         <w:rPr>
           <w:lang w:val="en-US"/>
         </w:rPr>
-        <w:t>ProductController</w:t>
-      </w:r>
-      <w:proofErr w:type="spellEnd"/>
-      <w:r>
-        <w:rPr>
-          <w:lang w:val="en-US"/>
-        </w:rPr>
-        <w:t xml:space="preserve">, </w:t>
-      </w:r>
-      <w:proofErr w:type="spellStart"/>
-      <w:r>
-        <w:rPr>
-          <w:lang w:val="en-US"/>
-        </w:rPr>
-        <w:t>UserManagementController</w:t>
-      </w:r>
-      <w:proofErr w:type="spellEnd"/>
-      <w:r>
-        <w:rPr>
-          <w:lang w:val="en-US"/>
-        </w:rPr>
-        <w:t xml:space="preserve"> </w:t>
-      </w:r>
-      <w:r>
-        <w:t>и</w:t>
-      </w:r>
-      <w:r>
-        <w:rPr>
-          <w:lang w:val="en-US"/>
-        </w:rPr>
-        <w:t xml:space="preserve"> </w:t>
-      </w:r>
-      <w:proofErr w:type="spellStart"/>
-      <w:r>
-        <w:rPr>
-          <w:lang w:val="en-US"/>
-        </w:rPr>
-        <w:t>ReportController</w:t>
-      </w:r>
-      <w:proofErr w:type="spellEnd"/>
-      <w:r>
-        <w:rPr>
-          <w:lang w:val="en-US"/>
-        </w:rPr>
-        <w:t>;</w:t>
+        <w:t xml:space="preserve"> ReportController;</w:t>
       </w:r>
     </w:p>
     <w:p>
@@ -5589,15 +4971,7 @@
         </w:rPr>
       </w:pPr>
       <w:r>
-        <w:t xml:space="preserve">Реализовать </w:t>
-      </w:r>
-      <w:proofErr w:type="spellStart"/>
-      <w:r>
-        <w:t>DirectorProfileController</w:t>
-      </w:r>
-      <w:proofErr w:type="spellEnd"/>
-      <w:r>
-        <w:t>, сервисы профиля, заказов и маршрутизации.</w:t>
+        <w:t>Реализовать DirectorProfileController, сервисы профиля, заказов и маршрутизации.</w:t>
       </w:r>
     </w:p>
     <w:p>
@@ -5623,31 +4997,7 @@
         </w:rPr>
       </w:pPr>
       <w:r>
-        <w:t xml:space="preserve">Подключить </w:t>
-      </w:r>
-      <w:proofErr w:type="spellStart"/>
-      <w:r>
-        <w:t>frontend</w:t>
-      </w:r>
-      <w:proofErr w:type="spellEnd"/>
-      <w:r>
-        <w:t xml:space="preserve"> API и интеграцию </w:t>
-      </w:r>
-      <w:proofErr w:type="spellStart"/>
-      <w:r>
-        <w:t>React</w:t>
-      </w:r>
-      <w:proofErr w:type="spellEnd"/>
-      <w:r>
-        <w:t xml:space="preserve">-клиента с </w:t>
-      </w:r>
-      <w:proofErr w:type="spellStart"/>
-      <w:r>
-        <w:t>backend</w:t>
-      </w:r>
-      <w:proofErr w:type="spellEnd"/>
-      <w:r>
-        <w:t>-контуром.</w:t>
+        <w:t>Подключить frontend API и интеграцию React-клиента с backend-контуром.</w:t>
       </w:r>
     </w:p>
     <w:p>
@@ -5680,23 +5030,7 @@
         <w:jc w:val="both"/>
       </w:pPr>
       <w:r>
-        <w:t xml:space="preserve">После этого выполняется развёртывание </w:t>
-      </w:r>
-      <w:proofErr w:type="spellStart"/>
-      <w:r>
-        <w:t>backend</w:t>
-      </w:r>
-      <w:proofErr w:type="spellEnd"/>
-      <w:r>
-        <w:t xml:space="preserve">-сервиса, </w:t>
-      </w:r>
-      <w:proofErr w:type="spellStart"/>
-      <w:r>
-        <w:t>frontend</w:t>
-      </w:r>
-      <w:proofErr w:type="spellEnd"/>
-      <w:r>
-        <w:t>-сайта и проверка основных пользовательских потоков на публичном адресе.</w:t>
+        <w:t>После этого выполняется развёртывание backend-сервиса, frontend-сайта и проверка основных пользовательских потоков на публичном адресе.</w:t>
       </w:r>
     </w:p>
     <w:p>
@@ -5706,15 +5040,7 @@
         <w:jc w:val="both"/>
       </w:pPr>
       <w:r>
-        <w:t xml:space="preserve">Финальным этапом выступает проверка публичного домена, учётных записей и эксплуатационных инструкций для работы с </w:t>
-      </w:r>
-      <w:proofErr w:type="spellStart"/>
-      <w:r>
-        <w:t>задеплоенным</w:t>
-      </w:r>
-      <w:proofErr w:type="spellEnd"/>
-      <w:r>
-        <w:t xml:space="preserve"> сайтом.</w:t>
+        <w:t>Финальным этапом выступает проверка публичного домена, учётных записей и эксплуатационных инструкций для работы с задеплоенным сайтом.</w:t>
       </w:r>
     </w:p>
     <w:p>
@@ -5725,39 +5051,7 @@
         <w:jc w:val="both"/>
       </w:pPr>
       <w:r>
-        <w:t xml:space="preserve">Для начала необходимо подготовить публичную версию проекта. </w:t>
-      </w:r>
-      <w:proofErr w:type="spellStart"/>
-      <w:r>
-        <w:t>Frontend</w:t>
-      </w:r>
-      <w:proofErr w:type="spellEnd"/>
-      <w:r>
-        <w:t xml:space="preserve"> разворачивается как </w:t>
-      </w:r>
-      <w:proofErr w:type="spellStart"/>
-      <w:r>
-        <w:t>static</w:t>
-      </w:r>
-      <w:proofErr w:type="spellEnd"/>
-      <w:r>
-        <w:t xml:space="preserve"> </w:t>
-      </w:r>
-      <w:proofErr w:type="spellStart"/>
-      <w:r>
-        <w:t>site</w:t>
-      </w:r>
-      <w:proofErr w:type="spellEnd"/>
-      <w:r>
-        <w:t xml:space="preserve"> и доступен по адресу https://farmer.indevs.in, а </w:t>
-      </w:r>
-      <w:proofErr w:type="spellStart"/>
-      <w:r>
-        <w:t>backend</w:t>
-      </w:r>
-      <w:proofErr w:type="spellEnd"/>
-      <w:r>
-        <w:t xml:space="preserve"> работает отдельным сервисом https://farm-sales-backend.onrender.com/api. Связь между ними задаётся переменными окружения и правилами CORS (рисунок 2.1).</w:t>
+        <w:t>Для начала необходимо подготовить публичную версию проекта. Frontend разворачивается как static site и доступен по адресу https://farmer.indevs.in, а backend работает отдельным сервисом https://farm-sales-backend.onrender.com/api. Связь между ними задаётся переменными окружения и правилами CORS (рисунок 2.1).</w:t>
       </w:r>
     </w:p>
     <w:p>
@@ -5769,7 +5063,6 @@
         <w:rPr>
           <w:noProof/>
         </w:rPr>
-        <w:lastRenderedPageBreak/>
         <w:drawing>
           <wp:inline distT="0" distB="0" distL="0" distR="0" wp14:anchorId="26A60BD3" wp14:editId="4B20539A">
             <wp:extent cx="5184000" cy="2916000"/>
@@ -5822,12 +5115,22 @@
     </w:p>
     <w:p>
       <w:pPr>
-        <w:pStyle w:val="af7"/>
-        <w:spacing w:line="320" w:lineRule="exact"/>
-        <w:ind w:firstLine="567"/>
-        <w:jc w:val="both"/>
-      </w:pPr>
-      <w:r>
+        <w:spacing w:after="0"/>
+        <w:jc w:val="center"/>
+        <w:rPr>
+          <w:rFonts w:eastAsia="Times New Roman" w:cs="Times New Roman"/>
+          <w:kern w:val="0"/>
+          <w:szCs w:val="28"/>
+          <w14:ligatures w14:val="none"/>
+        </w:rPr>
+      </w:pPr>
+      <w:r>
+        <w:rPr>
+          <w:rFonts w:eastAsia="Times New Roman" w:cs="Times New Roman"/>
+          <w:kern w:val="0"/>
+          <w:szCs w:val="28"/>
+          <w14:ligatures w14:val="none"/>
+        </w:rPr>
         <w:t>База данных Farm Sales сетевого приложения состоит из прикладных таблиц users, store_addresses, products, orders, order_items, audit_logs, stock_movements, order_timeline_events и realtime_notifications. Дополнительно Flyway ведёт служебную таблицу flyway_schema_history. Вместе эти таблицы образуют полный контур сопровождения заказа и логистики (рисунок 2.2).</w:t>
       </w:r>
     </w:p>
@@ -5837,6 +5140,9 @@
         <w:jc w:val="center"/>
       </w:pPr>
       <w:r>
+        <w:rPr>
+          <w:noProof/>
+        </w:rPr>
         <w:drawing>
           <wp:inline distT="0" distB="0" distL="0" distR="0" wp14:anchorId="2801A982" wp14:editId="62D0B7F7">
             <wp:extent cx="2486372" cy="2934109"/>
@@ -5884,15 +5190,7 @@
         </w:rPr>
       </w:pPr>
       <w:r>
-        <w:t xml:space="preserve">Рисунок 2.2 – База данных </w:t>
-      </w:r>
-      <w:proofErr w:type="spellStart"/>
-      <w:r>
-        <w:t>Farm</w:t>
-      </w:r>
-      <w:proofErr w:type="spellEnd"/>
-      <w:r>
-        <w:t xml:space="preserve"> Sales</w:t>
+        <w:t>Рисунок 2.2 – База данных Farm Sales</w:t>
       </w:r>
     </w:p>
     <w:p>
@@ -5902,15 +5200,7 @@
         <w:jc w:val="both"/>
       </w:pPr>
       <w:r>
-        <w:t xml:space="preserve">Таблица </w:t>
-      </w:r>
-      <w:proofErr w:type="spellStart"/>
-      <w:r>
-        <w:t>users</w:t>
-      </w:r>
-      <w:proofErr w:type="spellEnd"/>
-      <w:r>
-        <w:t xml:space="preserve"> – хранит пользователей системы и их роли</w:t>
+        <w:t>Таблица users – хранит пользователей системы и их роли</w:t>
       </w:r>
     </w:p>
     <w:p>
@@ -5919,13 +5209,8 @@
         <w:spacing w:before="0" w:after="0"/>
         <w:jc w:val="both"/>
       </w:pPr>
-      <w:proofErr w:type="spellStart"/>
-      <w:r>
-        <w:t>id</w:t>
-      </w:r>
-      <w:proofErr w:type="spellEnd"/>
-      <w:r>
-        <w:t xml:space="preserve"> – идентификатор пользователя, первичный ключ</w:t>
+      <w:r>
+        <w:t>id – идентификатор пользователя, первичный ключ</w:t>
       </w:r>
     </w:p>
     <w:p>
@@ -5934,13 +5219,8 @@
         <w:spacing w:before="0" w:after="0"/>
         <w:jc w:val="both"/>
       </w:pPr>
-      <w:proofErr w:type="spellStart"/>
-      <w:r>
-        <w:t>username</w:t>
-      </w:r>
-      <w:proofErr w:type="spellEnd"/>
-      <w:r>
-        <w:t xml:space="preserve"> – уникальный логин для входа в систему</w:t>
+      <w:r>
+        <w:t>username – уникальный логин для входа в систему</w:t>
       </w:r>
     </w:p>
     <w:p>
@@ -5949,13 +5229,8 @@
         <w:spacing w:before="0" w:after="0"/>
         <w:jc w:val="both"/>
       </w:pPr>
-      <w:proofErr w:type="spellStart"/>
-      <w:r>
-        <w:t>full_name</w:t>
-      </w:r>
-      <w:proofErr w:type="spellEnd"/>
-      <w:r>
-        <w:t xml:space="preserve"> – имя сотрудника или представителя магазина</w:t>
+      <w:r>
+        <w:t>full_name – имя сотрудника или представителя магазина</w:t>
       </w:r>
     </w:p>
     <w:p>
@@ -5964,13 +5239,8 @@
         <w:spacing w:before="0" w:after="0"/>
         <w:jc w:val="both"/>
       </w:pPr>
-      <w:proofErr w:type="spellStart"/>
-      <w:r>
-        <w:t>role</w:t>
-      </w:r>
-      <w:proofErr w:type="spellEnd"/>
-      <w:r>
-        <w:t xml:space="preserve"> – роль пользователя (DIRECTOR, MANAGER, LOGISTICIAN, DRIVER)</w:t>
+      <w:r>
+        <w:t>role – роль пользователя (DIRECTOR, MANAGER, LOGISTICIAN, DRIVER)</w:t>
       </w:r>
     </w:p>
     <w:p>
@@ -5979,14 +5249,8 @@
         <w:spacing w:before="0" w:after="0"/>
         <w:jc w:val="both"/>
       </w:pPr>
-      <w:proofErr w:type="spellStart"/>
-      <w:r>
-        <w:lastRenderedPageBreak/>
-        <w:t>company_name</w:t>
-      </w:r>
-      <w:proofErr w:type="spellEnd"/>
-      <w:r>
-        <w:t xml:space="preserve"> – наименование магазина или организации</w:t>
+      <w:r>
+        <w:t>company_name – наименование магазина или организации</w:t>
       </w:r>
     </w:p>
     <w:p>
@@ -5995,13 +5259,8 @@
         <w:spacing w:before="0" w:after="0"/>
         <w:jc w:val="both"/>
       </w:pPr>
-      <w:proofErr w:type="spellStart"/>
-      <w:r>
-        <w:t>phone</w:t>
-      </w:r>
-      <w:proofErr w:type="spellEnd"/>
-      <w:r>
-        <w:t xml:space="preserve"> – контактный телефон</w:t>
+      <w:r>
+        <w:t>phone – контактный телефон</w:t>
       </w:r>
     </w:p>
     <w:p>
@@ -6011,15 +5270,7 @@
         <w:jc w:val="both"/>
       </w:pPr>
       <w:r>
-        <w:t xml:space="preserve">Таблица </w:t>
-      </w:r>
-      <w:proofErr w:type="spellStart"/>
-      <w:r>
-        <w:t>store_addresses</w:t>
-      </w:r>
-      <w:proofErr w:type="spellEnd"/>
-      <w:r>
-        <w:t xml:space="preserve"> – хранит адреса доставки магазинов</w:t>
+        <w:t>Таблица store_addresses – хранит адреса доставки магазинов</w:t>
       </w:r>
     </w:p>
     <w:p>
@@ -6028,13 +5279,8 @@
         <w:spacing w:before="0" w:after="0"/>
         <w:jc w:val="both"/>
       </w:pPr>
-      <w:proofErr w:type="spellStart"/>
-      <w:r>
-        <w:t>id</w:t>
-      </w:r>
-      <w:proofErr w:type="spellEnd"/>
-      <w:r>
-        <w:t xml:space="preserve"> – идентификатор адреса, первичный ключ</w:t>
+      <w:r>
+        <w:t>id – идентификатор адреса, первичный ключ</w:t>
       </w:r>
     </w:p>
     <w:p>
@@ -6043,13 +5289,8 @@
         <w:spacing w:before="0" w:after="0"/>
         <w:jc w:val="both"/>
       </w:pPr>
-      <w:proofErr w:type="spellStart"/>
-      <w:r>
-        <w:t>user_id</w:t>
-      </w:r>
-      <w:proofErr w:type="spellEnd"/>
-      <w:r>
-        <w:t xml:space="preserve"> – ссылка на владельца адреса</w:t>
+      <w:r>
+        <w:t>user_id – ссылка на владельца адреса</w:t>
       </w:r>
     </w:p>
     <w:p>
@@ -6058,13 +5299,8 @@
         <w:spacing w:before="0" w:after="0"/>
         <w:jc w:val="both"/>
       </w:pPr>
-      <w:proofErr w:type="spellStart"/>
-      <w:r>
-        <w:t>label</w:t>
-      </w:r>
-      <w:proofErr w:type="spellEnd"/>
-      <w:r>
-        <w:t xml:space="preserve"> – краткое название точки доставки</w:t>
+      <w:r>
+        <w:t>label – краткое название точки доставки</w:t>
       </w:r>
     </w:p>
     <w:p>
@@ -6073,21 +5309,8 @@
         <w:spacing w:before="0" w:after="0"/>
         <w:jc w:val="both"/>
       </w:pPr>
-      <w:proofErr w:type="spellStart"/>
-      <w:r>
-        <w:t>address_line</w:t>
-      </w:r>
-      <w:proofErr w:type="spellEnd"/>
-      <w:r>
-        <w:t xml:space="preserve"> – </w:t>
-      </w:r>
-      <w:proofErr w:type="spellStart"/>
-      <w:r>
-        <w:t>человекочитаемый</w:t>
-      </w:r>
-      <w:proofErr w:type="spellEnd"/>
-      <w:r>
-        <w:t xml:space="preserve"> адрес</w:t>
+      <w:r>
+        <w:t>address_line – человекочитаемый адрес</w:t>
       </w:r>
     </w:p>
     <w:p>
@@ -6096,21 +5319,8 @@
         <w:spacing w:before="0" w:after="0"/>
         <w:jc w:val="both"/>
       </w:pPr>
-      <w:proofErr w:type="spellStart"/>
-      <w:r>
-        <w:t>latitude</w:t>
-      </w:r>
-      <w:proofErr w:type="spellEnd"/>
-      <w:r>
-        <w:t xml:space="preserve"> / </w:t>
-      </w:r>
-      <w:proofErr w:type="spellStart"/>
-      <w:r>
-        <w:t>longitude</w:t>
-      </w:r>
-      <w:proofErr w:type="spellEnd"/>
-      <w:r>
-        <w:t xml:space="preserve"> – координаты для карты и маршрута</w:t>
+      <w:r>
+        <w:t>latitude / longitude – координаты для карты и маршрута</w:t>
       </w:r>
     </w:p>
     <w:p>
@@ -6120,15 +5330,7 @@
         <w:jc w:val="both"/>
       </w:pPr>
       <w:r>
-        <w:t xml:space="preserve">Таблица </w:t>
-      </w:r>
-      <w:proofErr w:type="spellStart"/>
-      <w:r>
-        <w:t>products</w:t>
-      </w:r>
-      <w:proofErr w:type="spellEnd"/>
-      <w:r>
-        <w:t xml:space="preserve"> – хранит каталог фермерской продукции</w:t>
+        <w:t>Таблица products – хранит каталог фермерской продукции</w:t>
       </w:r>
     </w:p>
     <w:p>
@@ -6137,13 +5339,8 @@
         <w:spacing w:before="0" w:after="0"/>
         <w:jc w:val="both"/>
       </w:pPr>
-      <w:proofErr w:type="spellStart"/>
-      <w:r>
-        <w:t>id</w:t>
-      </w:r>
-      <w:proofErr w:type="spellEnd"/>
-      <w:r>
-        <w:t xml:space="preserve"> – идентификатор товара, первичный ключ</w:t>
+      <w:r>
+        <w:t>id – идентификатор товара, первичный ключ</w:t>
       </w:r>
     </w:p>
     <w:p>
@@ -6152,13 +5349,8 @@
         <w:spacing w:before="0" w:after="0"/>
         <w:jc w:val="both"/>
       </w:pPr>
-      <w:proofErr w:type="spellStart"/>
-      <w:r>
-        <w:t>name</w:t>
-      </w:r>
-      <w:proofErr w:type="spellEnd"/>
-      <w:r>
-        <w:t xml:space="preserve"> – название продукции</w:t>
+      <w:r>
+        <w:t>name – название продукции</w:t>
       </w:r>
     </w:p>
     <w:p>
@@ -6167,13 +5359,8 @@
         <w:spacing w:before="0" w:after="0"/>
         <w:jc w:val="both"/>
       </w:pPr>
-      <w:proofErr w:type="spellStart"/>
-      <w:r>
-        <w:t>category</w:t>
-      </w:r>
-      <w:proofErr w:type="spellEnd"/>
-      <w:r>
-        <w:t xml:space="preserve"> – категория товара</w:t>
+      <w:r>
+        <w:t>category – категория товара</w:t>
       </w:r>
     </w:p>
     <w:p>
@@ -6182,13 +5369,8 @@
         <w:spacing w:before="0" w:after="0"/>
         <w:jc w:val="both"/>
       </w:pPr>
-      <w:proofErr w:type="spellStart"/>
-      <w:r>
-        <w:t>price</w:t>
-      </w:r>
-      <w:proofErr w:type="spellEnd"/>
-      <w:r>
-        <w:t xml:space="preserve"> – цена единицы продукции</w:t>
+      <w:r>
+        <w:t>price – цена единицы продукции</w:t>
       </w:r>
     </w:p>
     <w:p>
@@ -6197,13 +5379,8 @@
         <w:spacing w:before="0" w:after="0"/>
         <w:jc w:val="both"/>
       </w:pPr>
-      <w:proofErr w:type="spellStart"/>
-      <w:r>
-        <w:t>weight_kg</w:t>
-      </w:r>
-      <w:proofErr w:type="spellEnd"/>
-      <w:r>
-        <w:t xml:space="preserve"> и volume_m3 – логистические параметры для расчёта маршрута</w:t>
+      <w:r>
+        <w:t>weight_kg и volume_m3 – логистические параметры для расчёта маршрута</w:t>
       </w:r>
     </w:p>
     <w:p>
@@ -6212,13 +5389,8 @@
         <w:spacing w:before="0" w:after="0"/>
         <w:jc w:val="both"/>
       </w:pPr>
-      <w:proofErr w:type="spellStart"/>
-      <w:r>
-        <w:t>photo_url</w:t>
-      </w:r>
-      <w:proofErr w:type="spellEnd"/>
-      <w:r>
-        <w:t xml:space="preserve"> – ссылка на карточку изображения</w:t>
+      <w:r>
+        <w:t>photo_url – ссылка на карточку изображения</w:t>
       </w:r>
     </w:p>
     <w:p>
@@ -6228,15 +5400,7 @@
         <w:jc w:val="both"/>
       </w:pPr>
       <w:r>
-        <w:t xml:space="preserve">Таблица </w:t>
-      </w:r>
-      <w:proofErr w:type="spellStart"/>
-      <w:r>
-        <w:t>orders</w:t>
-      </w:r>
-      <w:proofErr w:type="spellEnd"/>
-      <w:r>
-        <w:t xml:space="preserve"> – хранит документы заказа</w:t>
+        <w:t>Таблица orders – хранит документы заказа</w:t>
       </w:r>
     </w:p>
     <w:p>
@@ -6245,13 +5409,8 @@
         <w:spacing w:before="0" w:after="0"/>
         <w:jc w:val="both"/>
       </w:pPr>
-      <w:proofErr w:type="spellStart"/>
-      <w:r>
-        <w:t>id</w:t>
-      </w:r>
-      <w:proofErr w:type="spellEnd"/>
-      <w:r>
-        <w:t xml:space="preserve"> – идентификатор заказа, первичный ключ</w:t>
+      <w:r>
+        <w:t>id – идентификатор заказа, первичный ключ</w:t>
       </w:r>
     </w:p>
     <w:p>
@@ -6260,13 +5419,8 @@
         <w:spacing w:before="0" w:after="0"/>
         <w:jc w:val="both"/>
       </w:pPr>
-      <w:proofErr w:type="spellStart"/>
-      <w:r>
-        <w:t>customer_id</w:t>
-      </w:r>
-      <w:proofErr w:type="spellEnd"/>
-      <w:r>
-        <w:t xml:space="preserve"> – ссылка на директора магазина</w:t>
+      <w:r>
+        <w:t>customer_id – ссылка на директора магазина</w:t>
       </w:r>
     </w:p>
     <w:p>
@@ -6289,7 +5443,6 @@
         <w:t>assigned_driver_id – назначенный водитель</w:t>
       </w:r>
     </w:p>
-    <CT_P/>
     <w:p>
       <w:pPr>
         <w:pStyle w:val="ds-markdown-paragraph"/>
@@ -6306,21 +5459,8 @@
         <w:spacing w:before="0" w:after="0"/>
         <w:jc w:val="both"/>
       </w:pPr>
-      <w:proofErr w:type="spellStart"/>
-      <w:r>
-        <w:t>created_at</w:t>
-      </w:r>
-      <w:proofErr w:type="spellEnd"/>
-      <w:r>
-        <w:t xml:space="preserve"> и </w:t>
-      </w:r>
-      <w:proofErr w:type="spellStart"/>
-      <w:r>
-        <w:t>approved_at</w:t>
-      </w:r>
-      <w:proofErr w:type="spellEnd"/>
-      <w:r>
-        <w:t xml:space="preserve"> – временные метки жизненного цикла</w:t>
+      <w:r>
+        <w:t>created_at и approved_at – временные метки жизненного цикла</w:t>
       </w:r>
     </w:p>
     <w:p>
@@ -6330,15 +5470,7 @@
         <w:jc w:val="both"/>
       </w:pPr>
       <w:r>
-        <w:t xml:space="preserve">Таблица </w:t>
-      </w:r>
-      <w:proofErr w:type="spellStart"/>
-      <w:r>
-        <w:t>order_items</w:t>
-      </w:r>
-      <w:proofErr w:type="spellEnd"/>
-      <w:r>
-        <w:t xml:space="preserve"> – хранит позиции внутри заказа</w:t>
+        <w:t>Таблица order_items – хранит позиции внутри заказа</w:t>
       </w:r>
     </w:p>
     <w:p>
@@ -6347,13 +5479,8 @@
         <w:spacing w:before="0" w:after="0"/>
         <w:jc w:val="both"/>
       </w:pPr>
-      <w:proofErr w:type="spellStart"/>
-      <w:r>
-        <w:t>order_id</w:t>
-      </w:r>
-      <w:proofErr w:type="spellEnd"/>
-      <w:r>
-        <w:t xml:space="preserve"> – ссылка на документ заказа</w:t>
+      <w:r>
+        <w:t>order_id – ссылка на документ заказа</w:t>
       </w:r>
     </w:p>
     <w:p>
@@ -6362,13 +5489,8 @@
         <w:spacing w:before="0" w:after="0"/>
         <w:jc w:val="both"/>
       </w:pPr>
-      <w:proofErr w:type="spellStart"/>
-      <w:r>
-        <w:t>product_id</w:t>
-      </w:r>
-      <w:proofErr w:type="spellEnd"/>
-      <w:r>
-        <w:t xml:space="preserve"> – ссылка на товар</w:t>
+      <w:r>
+        <w:t>product_id – ссылка на товар</w:t>
       </w:r>
     </w:p>
     <w:p>
@@ -6377,13 +5499,8 @@
         <w:spacing w:before="0" w:after="0"/>
         <w:jc w:val="both"/>
       </w:pPr>
-      <w:proofErr w:type="spellStart"/>
-      <w:r>
-        <w:t>quantity</w:t>
-      </w:r>
-      <w:proofErr w:type="spellEnd"/>
-      <w:r>
-        <w:t xml:space="preserve"> – количество товара в заказе</w:t>
+      <w:r>
+        <w:t>quantity – количество товара в заказе</w:t>
       </w:r>
     </w:p>
     <w:p>
@@ -6392,23 +5509,41 @@
         <w:spacing w:before="0" w:after="0"/>
         <w:jc w:val="both"/>
       </w:pPr>
-      <w:proofErr w:type="spellStart"/>
-      <w:r>
-        <w:lastRenderedPageBreak/>
-        <w:t>price</w:t>
-      </w:r>
-      <w:proofErr w:type="spellEnd"/>
-      <w:r>
-        <w:t xml:space="preserve"> – цена товара на момент оформления</w:t>
-      </w:r>
-    </w:p>
-    <w:p>
-      <w:pPr>
-        <w:pStyle w:val="ds-markdown-paragraph"/>
-        <w:spacing w:before="0" w:after="0"/>
-        <w:jc w:val="both"/>
-      </w:pPr>
-      <w:r>
+      <w:r>
+        <w:t>price – цена товара на момент оформления</w:t>
+      </w:r>
+    </w:p>
+    <w:p>
+      <w:pPr>
+        <w:pStyle w:val="1"/>
+        <w:tabs>
+          <w:tab w:val="left" w:pos="1554"/>
+        </w:tabs>
+        <w:spacing w:before="0" w:after="0" w:line="320" w:lineRule="exact"/>
+        <w:jc w:val="both"/>
+        <w:rPr>
+          <w:rFonts w:eastAsia="Times New Roman"/>
+          <w:b w:val="0"/>
+          <w:bCs w:val="0"/>
+          <w:kern w:val="0"/>
+          <w:sz w:val="24"/>
+          <w:szCs w:val="24"/>
+          <w:lang w:val="ru-BY" w:eastAsia="ru-BY"/>
+          <w14:ligatures w14:val="none"/>
+        </w:rPr>
+      </w:pPr>
+      <w:bookmarkStart w:id="5" w:name="_Toc227879196"/>
+      <w:r>
+        <w:rPr>
+          <w:rFonts w:eastAsia="Times New Roman"/>
+          <w:b w:val="0"/>
+          <w:bCs w:val="0"/>
+          <w:kern w:val="0"/>
+          <w:sz w:val="24"/>
+          <w:szCs w:val="24"/>
+          <w:lang w:val="ru-BY" w:eastAsia="ru-BY"/>
+          <w14:ligatures w14:val="none"/>
+        </w:rPr>
         <w:t>Таблицы audit_logs, stock_movements, order_timeline_events и realtime_notifications – обслуживают аудит действий, историю изменений, движение остатков и уведомления интерфейса</w:t>
       </w:r>
     </w:p>
@@ -6421,11 +5556,74 @@
         <w:spacing w:before="0" w:after="0" w:line="320" w:lineRule="exact"/>
         <w:jc w:val="both"/>
       </w:pPr>
-      <w:bookmarkStart w:id="5" w:name="_Toc227879196"/>
       <w:r>
         <w:t>2.2 Описание программы</w:t>
       </w:r>
       <w:bookmarkEnd w:id="5"/>
+    </w:p>
+    <w:p>
+      <w:pPr>
+        <w:spacing w:after="0"/>
+        <w:jc w:val="center"/>
+        <w:rPr>
+          <w:rFonts w:eastAsia="Times New Roman" w:cs="Times New Roman"/>
+          <w:kern w:val="0"/>
+          <w:szCs w:val="28"/>
+          <w14:ligatures w14:val="none"/>
+        </w:rPr>
+      </w:pPr>
+      <w:r>
+        <w:rPr>
+          <w:rFonts w:eastAsia="Times New Roman" w:cs="Times New Roman"/>
+          <w:kern w:val="0"/>
+          <w:szCs w:val="28"/>
+          <w14:ligatures w14:val="none"/>
+        </w:rPr>
+        <w:t>Приложение имеет модульную структуру, где корневой уровень содержит deploy-конфигурацию и эксплуатационные файлы, а логика системы разделена между backend и frontend. Такая организация соответствует реальной структуре репозитория, представленной на рисунке 2.3.</w:t>
+      </w:r>
+    </w:p>
+    <w:p>
+      <w:pPr>
+        <w:spacing w:after="0"/>
+        <w:jc w:val="center"/>
+      </w:pPr>
+    </w:p>
+    <w:p>
+      <w:pPr>
+        <w:spacing w:after="0"/>
+        <w:jc w:val="center"/>
+      </w:pPr>
+    </w:p>
+    <w:p>
+      <w:pPr>
+        <w:spacing w:after="0"/>
+        <w:jc w:val="center"/>
+      </w:pPr>
+    </w:p>
+    <w:p>
+      <w:pPr>
+        <w:spacing w:after="0"/>
+        <w:jc w:val="center"/>
+      </w:pPr>
+    </w:p>
+    <w:p>
+      <w:pPr>
+        <w:spacing w:after="0"/>
+        <w:jc w:val="center"/>
+      </w:pPr>
+    </w:p>
+    <w:p>
+      <w:pPr>
+        <w:pStyle w:val="af7"/>
+        <w:ind w:firstLine="567"/>
+        <w:jc w:val="center"/>
+        <w:rPr>
+          <w:spacing w:val="-2"/>
+        </w:rPr>
+      </w:pPr>
+      <w:r>
+        <w:t>Рисунок 2.3 – Структура приложения</w:t>
+      </w:r>
     </w:p>
     <w:p>
       <w:pPr>
@@ -6435,50 +5633,7 @@
         <w:jc w:val="both"/>
       </w:pPr>
       <w:r>
-        <w:t>Приложение имеет модульную структуру, где корневой уровень содержит deploy-конфигурацию и эксплуатационные файлы, а логика системы разделена между backend и frontend. Такая организация соответствует реальной структуре репозитория, представленной на рисунке 2.3.</w:t>
-      </w:r>
-    </w:p>
-    <w:p>
-      <w:pPr>
-        <w:spacing w:after="0"/>
-        <w:jc w:val="center"/>
-      </w:pPr>
-    </w:p>
-    <w:p>
-      <w:pPr>
-        <w:spacing w:after="0"/>
-        <w:jc w:val="center"/>
-      </w:pPr>
-    </w:p>
-    <w:p>
-      <w:pPr>
-        <w:spacing w:after="0"/>
-        <w:jc w:val="center"/>
-      </w:pPr>
-    </w:p>
-    <w:p>
-      <w:pPr>
-        <w:spacing w:after="0"/>
-        <w:jc w:val="center"/>
-      </w:pPr>
-    </w:p>
-    <w:p>
-      <w:pPr>
-        <w:spacing w:after="0"/>
-        <w:jc w:val="center"/>
-      </w:pPr>
-    </w:p>
-    <w:p>
-      <w:pPr>
-        <w:pStyle w:val="af7"/>
-        <w:ind w:firstLine="567"/>
-        <w:jc w:val="center"/>
-        <w:rPr>
-          <w:spacing w:val="-2"/>
-        </w:rPr>
-      </w:pPr>
-      <w:r>
-        <w:t>Рисунок 2.3 – Структура приложения</w:t>
+        <w:t>Папка backend/src/main/java/com/farm/sales содержит основную программную логику приложения.</w:t>
       </w:r>
     </w:p>
     <w:p>
@@ -6489,73 +5644,6 @@
         <w:jc w:val="both"/>
       </w:pPr>
       <w:r>
-        <w:t xml:space="preserve">Папка </w:t>
-      </w:r>
-      <w:proofErr w:type="spellStart"/>
-      <w:r>
-        <w:t>backend</w:t>
-      </w:r>
-      <w:proofErr w:type="spellEnd"/>
-      <w:r>
-        <w:t>/</w:t>
-      </w:r>
-      <w:proofErr w:type="spellStart"/>
-      <w:r>
-        <w:t>src</w:t>
-      </w:r>
-      <w:proofErr w:type="spellEnd"/>
-      <w:r>
-        <w:t>/</w:t>
-      </w:r>
-      <w:proofErr w:type="spellStart"/>
-      <w:r>
-        <w:t>main</w:t>
-      </w:r>
-      <w:proofErr w:type="spellEnd"/>
-      <w:r>
-        <w:t>/</w:t>
-      </w:r>
-      <w:proofErr w:type="spellStart"/>
-      <w:r>
-        <w:t>java</w:t>
-      </w:r>
-      <w:proofErr w:type="spellEnd"/>
-      <w:r>
-        <w:t>/</w:t>
-      </w:r>
-      <w:proofErr w:type="spellStart"/>
-      <w:r>
-        <w:t>com</w:t>
-      </w:r>
-      <w:proofErr w:type="spellEnd"/>
-      <w:r>
-        <w:t>/</w:t>
-      </w:r>
-      <w:proofErr w:type="spellStart"/>
-      <w:r>
-        <w:t>farm</w:t>
-      </w:r>
-      <w:proofErr w:type="spellEnd"/>
-      <w:r>
-        <w:t>/</w:t>
-      </w:r>
-      <w:proofErr w:type="spellStart"/>
-      <w:r>
-        <w:t>sales</w:t>
-      </w:r>
-      <w:proofErr w:type="spellEnd"/>
-      <w:r>
-        <w:t xml:space="preserve"> содержит основную программную логику приложения.</w:t>
-      </w:r>
-    </w:p>
-    <w:p>
-      <w:pPr>
-        <w:pStyle w:val="af7"/>
-        <w:spacing w:line="320" w:lineRule="exact"/>
-        <w:ind w:firstLine="567"/>
-        <w:jc w:val="both"/>
-      </w:pPr>
-      <w:r>
         <w:t>Именно в ней реализованы серверная часть веб-приложения, работа с базой данных, обработка запросов пользователей, бизнес-логика системы, транспортная задача, отчёты и публикация уведомлений. Структура данной папки организована по пакетам, каждый из которых отвечает за отдельную подсистему приложения.</w:t>
       </w:r>
     </w:p>
@@ -6570,15 +5658,7 @@
         </w:rPr>
       </w:pPr>
       <w:r>
-        <w:t xml:space="preserve">Пакет </w:t>
-      </w:r>
-      <w:proofErr w:type="spellStart"/>
-      <w:r>
-        <w:t>model</w:t>
-      </w:r>
-      <w:proofErr w:type="spellEnd"/>
-      <w:r>
-        <w:t xml:space="preserve"> содержит классы-сущности предметной области, которые используются для хранения данных, получаемых из базы данных, а также для передачи этих данных между слоями приложения.</w:t>
+        <w:t>Пакет model содержит классы-сущности предметной области, которые используются для хранения данных, получаемых из базы данных, а также для передачи этих данных между слоями приложения.</w:t>
       </w:r>
     </w:p>
     <w:p>
@@ -6637,13 +5717,8 @@
         </w:rPr>
       </w:pPr>
       <w:r>
-        <w:t xml:space="preserve">Рисунок 2.4 – Пакет </w:t>
-      </w:r>
-      <w:proofErr w:type="spellStart"/>
-      <w:r>
-        <w:t>model</w:t>
-      </w:r>
-      <w:proofErr w:type="spellEnd"/>
+        <w:t>Рисунок 2.4 – Пакет model</w:t>
+      </w:r>
     </w:p>
     <w:p>
       <w:pPr>
@@ -6670,35 +5745,21 @@
         </w:rPr>
       </w:pPr>
       <w:r>
-        <w:t xml:space="preserve">User и </w:t>
-      </w:r>
-      <w:proofErr w:type="spellStart"/>
-      <w:r>
-        <w:t>Role</w:t>
-      </w:r>
-      <w:proofErr w:type="spellEnd"/>
-      <w:r>
-        <w:t xml:space="preserve"> — модель пользователя системы. Хранят сведения об учётной записи: идентификатор, логин, пароль, роль, имя пользователя и контактные данные, необходимые для авторизации и персонализации интерфейса.</w:t>
-      </w:r>
-    </w:p>
-    <w:p>
-      <w:pPr>
-        <w:spacing w:after="0"/>
-        <w:ind w:firstLine="567"/>
-        <w:jc w:val="both"/>
-        <w:rPr>
-          <w:rFonts w:cs="Times New Roman"/>
-          <w:szCs w:val="28"/>
-        </w:rPr>
-      </w:pPr>
-      <w:proofErr w:type="spellStart"/>
-      <w:r>
-        <w:lastRenderedPageBreak/>
-        <w:t>StoreAddress</w:t>
-      </w:r>
-      <w:proofErr w:type="spellEnd"/>
-      <w:r>
-        <w:t xml:space="preserve"> — модель адреса доставки. Содержит данные об адресе клиента, а также географические координаты, которые используются в модуле маршрутизации.</w:t>
+        <w:t>User и Role — модель пользователя системы. Хранят сведения об учётной записи: идентификатор, логин, пароль, роль, имя пользователя и контактные данные, необходимые для авторизации и персонализации интерфейса.</w:t>
+      </w:r>
+    </w:p>
+    <w:p>
+      <w:pPr>
+        <w:spacing w:after="0"/>
+        <w:ind w:firstLine="567"/>
+        <w:jc w:val="both"/>
+        <w:rPr>
+          <w:rFonts w:cs="Times New Roman"/>
+          <w:szCs w:val="28"/>
+        </w:rPr>
+      </w:pPr>
+      <w:r>
+        <w:t>StoreAddress — модель адреса доставки. Содержит данные об адресе клиента, а также географические координаты, которые используются в модуле маршрутизации.</w:t>
       </w:r>
     </w:p>
     <w:p>
@@ -6725,152 +5786,92 @@
           <w:szCs w:val="28"/>
         </w:rPr>
       </w:pPr>
-      <w:proofErr w:type="spellStart"/>
-      <w:r>
-        <w:t>Order</w:t>
-      </w:r>
-      <w:proofErr w:type="spellEnd"/>
-      <w:r>
-        <w:t xml:space="preserve"> — модель заказа. Содержит информацию о заказе, его статусе, привязке к клиенту, водителю, адресу, времени создания и другим служебным данным.</w:t>
-      </w:r>
-    </w:p>
-    <w:p>
-      <w:pPr>
-        <w:spacing w:after="0"/>
-        <w:ind w:firstLine="567"/>
-        <w:jc w:val="both"/>
-        <w:rPr>
-          <w:rFonts w:cs="Times New Roman"/>
-          <w:szCs w:val="28"/>
-        </w:rPr>
-      </w:pPr>
-      <w:proofErr w:type="spellStart"/>
-      <w:r>
-        <w:t>OrderItem</w:t>
-      </w:r>
-      <w:proofErr w:type="spellEnd"/>
-      <w:r>
-        <w:t xml:space="preserve"> — модель позиции заказа. Представляет отдельный товар внутри заказа, его количество, цену и связь с конкретным заказом.</w:t>
-      </w:r>
-    </w:p>
-    <w:p>
-      <w:pPr>
-        <w:spacing w:after="0"/>
-        <w:ind w:firstLine="567"/>
-        <w:jc w:val="both"/>
-        <w:rPr>
-          <w:rFonts w:cs="Times New Roman"/>
-          <w:szCs w:val="28"/>
-        </w:rPr>
-      </w:pPr>
-      <w:proofErr w:type="spellStart"/>
-      <w:r>
-        <w:t>OrderTimelineEvent</w:t>
-      </w:r>
-      <w:proofErr w:type="spellEnd"/>
-      <w:r>
-        <w:t xml:space="preserve"> — модель записи истории, фиксирующая подтверждение, назначение маршрута и завершение доставки.</w:t>
-      </w:r>
-    </w:p>
-    <w:p>
-      <w:pPr>
-        <w:spacing w:after="0"/>
-        <w:ind w:firstLine="567"/>
-        <w:jc w:val="both"/>
-        <w:rPr>
-          <w:rFonts w:cs="Times New Roman"/>
-          <w:szCs w:val="28"/>
-        </w:rPr>
-      </w:pPr>
-      <w:proofErr w:type="spellStart"/>
-      <w:r>
-        <w:t>RealtimeNotification</w:t>
-      </w:r>
-      <w:proofErr w:type="spellEnd"/>
-      <w:r>
-        <w:t xml:space="preserve"> — модель уведомления, используемая для передачи служебных событий между </w:t>
-      </w:r>
-      <w:proofErr w:type="spellStart"/>
-      <w:r>
-        <w:t>backend</w:t>
-      </w:r>
-      <w:proofErr w:type="spellEnd"/>
-      <w:r>
-        <w:t xml:space="preserve"> и пользовательским интерфейсом.</w:t>
-      </w:r>
-    </w:p>
-    <w:p>
-      <w:pPr>
-        <w:spacing w:after="0"/>
-        <w:ind w:firstLine="567"/>
-        <w:jc w:val="both"/>
-        <w:rPr>
-          <w:rFonts w:cs="Times New Roman"/>
-          <w:szCs w:val="28"/>
-        </w:rPr>
-      </w:pPr>
-      <w:r>
-        <w:t xml:space="preserve">Связи между указанными сущностями отражают реальные процессы отдела сбыта: один директор магазина может иметь несколько адресов доставки, один заказ включает множество позиций товара, а каждое изменение статуса сопровождается записью в истории. Благодаря такому описанию предметной области бизнес-операции </w:t>
-      </w:r>
-      <w:proofErr w:type="spellStart"/>
-      <w:r>
-        <w:t>backend</w:t>
-      </w:r>
-      <w:proofErr w:type="spellEnd"/>
-      <w:r>
-        <w:t xml:space="preserve"> остаются прозрачными и предсказуемыми.</w:t>
-      </w:r>
-    </w:p>
-    <w:p>
-      <w:pPr>
-        <w:spacing w:after="0"/>
-        <w:ind w:firstLine="567"/>
-        <w:jc w:val="both"/>
-        <w:rPr>
-          <w:rFonts w:cs="Times New Roman"/>
-          <w:szCs w:val="28"/>
-        </w:rPr>
-      </w:pPr>
-      <w:r>
-        <w:t xml:space="preserve">Таким образом, пакет </w:t>
-      </w:r>
-      <w:proofErr w:type="spellStart"/>
-      <w:r>
-        <w:t>model</w:t>
-      </w:r>
-      <w:proofErr w:type="spellEnd"/>
-      <w:r>
-        <w:t xml:space="preserve"> формирует объектное представление данных системы и является основой для работы остальных модулей приложения.</w:t>
-      </w:r>
-    </w:p>
-    <w:p>
-      <w:pPr>
-        <w:spacing w:after="0"/>
-        <w:ind w:firstLine="567"/>
-        <w:jc w:val="both"/>
-        <w:rPr>
-          <w:rFonts w:cs="Times New Roman"/>
-          <w:szCs w:val="28"/>
-        </w:rPr>
-      </w:pPr>
-      <w:r>
-        <w:t xml:space="preserve">Пакет </w:t>
-      </w:r>
-      <w:proofErr w:type="spellStart"/>
-      <w:r>
-        <w:t>repository</w:t>
-      </w:r>
-      <w:proofErr w:type="spellEnd"/>
-      <w:r>
-        <w:t xml:space="preserve"> реализует слой доступа к данным, то есть взаимодействие приложения с </w:t>
-      </w:r>
-      <w:proofErr w:type="spellStart"/>
-      <w:r>
-        <w:t>PostgreSQL</w:t>
-      </w:r>
-      <w:proofErr w:type="spellEnd"/>
-      <w:r>
-        <w:t>. В нём сосредоточены классы, выполняющие выборку, сохранение и агрегацию данных для пользовательских сценариев.</w:t>
+      <w:r>
+        <w:t>Order — модель заказа. Содержит информацию о заказе, его статусе, привязке к клиенту, водителю, адресу, времени создания и другим служебным данным.</w:t>
+      </w:r>
+    </w:p>
+    <w:p>
+      <w:pPr>
+        <w:spacing w:after="0"/>
+        <w:ind w:firstLine="567"/>
+        <w:jc w:val="both"/>
+        <w:rPr>
+          <w:rFonts w:cs="Times New Roman"/>
+          <w:szCs w:val="28"/>
+        </w:rPr>
+      </w:pPr>
+      <w:r>
+        <w:t>OrderItem — модель позиции заказа. Представляет отдельный товар внутри заказа, его количество, цену и связь с конкретным заказом.</w:t>
+      </w:r>
+    </w:p>
+    <w:p>
+      <w:pPr>
+        <w:spacing w:after="0"/>
+        <w:ind w:firstLine="567"/>
+        <w:jc w:val="both"/>
+        <w:rPr>
+          <w:rFonts w:cs="Times New Roman"/>
+          <w:szCs w:val="28"/>
+        </w:rPr>
+      </w:pPr>
+      <w:r>
+        <w:t>OrderTimelineEvent — модель записи истории, фиксирующая подтверждение, назначение маршрута и завершение доставки.</w:t>
+      </w:r>
+    </w:p>
+    <w:p>
+      <w:pPr>
+        <w:spacing w:after="0"/>
+        <w:ind w:firstLine="567"/>
+        <w:jc w:val="both"/>
+        <w:rPr>
+          <w:rFonts w:cs="Times New Roman"/>
+          <w:szCs w:val="28"/>
+        </w:rPr>
+      </w:pPr>
+      <w:r>
+        <w:t>RealtimeNotification — модель уведомления, используемая для передачи служебных событий между backend и пользовательским интерфейсом.</w:t>
+      </w:r>
+    </w:p>
+    <w:p>
+      <w:pPr>
+        <w:spacing w:after="0"/>
+        <w:ind w:firstLine="567"/>
+        <w:jc w:val="both"/>
+        <w:rPr>
+          <w:rFonts w:cs="Times New Roman"/>
+          <w:szCs w:val="28"/>
+        </w:rPr>
+      </w:pPr>
+      <w:r>
+        <w:t>Связи между указанными сущностями отражают реальные процессы отдела сбыта: один директор магазина может иметь несколько адресов доставки, один заказ включает множество позиций товара, а каждое изменение статуса сопровождается записью в истории. Благодаря такому описанию предметной области бизнес-операции backend остаются прозрачными и предсказуемыми.</w:t>
+      </w:r>
+    </w:p>
+    <w:p>
+      <w:pPr>
+        <w:spacing w:after="0"/>
+        <w:ind w:firstLine="567"/>
+        <w:jc w:val="both"/>
+        <w:rPr>
+          <w:rFonts w:cs="Times New Roman"/>
+          <w:szCs w:val="28"/>
+        </w:rPr>
+      </w:pPr>
+      <w:r>
+        <w:t>Таким образом, пакет model формирует объектное представление данных системы и является основой для работы остальных модулей приложения.</w:t>
+      </w:r>
+    </w:p>
+    <w:p>
+      <w:pPr>
+        <w:spacing w:after="0"/>
+        <w:ind w:firstLine="567"/>
+        <w:jc w:val="both"/>
+        <w:rPr>
+          <w:rFonts w:cs="Times New Roman"/>
+          <w:szCs w:val="28"/>
+        </w:rPr>
+      </w:pPr>
+      <w:r>
+        <w:t>Пакет repository реализует слой доступа к данным, то есть взаимодействие приложения с PostgreSQL. В нём сосредоточены классы, выполняющие выборку, сохранение и агрегацию данных для пользовательских сценариев.</w:t>
       </w:r>
     </w:p>
     <w:p>
@@ -6929,13 +5930,8 @@
         </w:rPr>
       </w:pPr>
       <w:r>
-        <w:t xml:space="preserve">Рисунок 2.5 – Пакет </w:t>
-      </w:r>
-      <w:proofErr w:type="spellStart"/>
-      <w:r>
-        <w:t>repository</w:t>
-      </w:r>
-      <w:proofErr w:type="spellEnd"/>
+        <w:t>Рисунок 2.5 – Пакет repository</w:t>
+      </w:r>
     </w:p>
     <w:p>
       <w:pPr>
@@ -6961,147 +5957,106 @@
           <w:szCs w:val="28"/>
         </w:rPr>
       </w:pPr>
-      <w:proofErr w:type="spellStart"/>
-      <w:r>
-        <w:t>OrderRepository</w:t>
-      </w:r>
-      <w:proofErr w:type="spellEnd"/>
-      <w:r>
-        <w:t xml:space="preserve"> — отвечает за работу с документами заказа, их поиском, фильтрацией по статусам и выдачей данных для логистики.</w:t>
-      </w:r>
-    </w:p>
-    <w:p>
-      <w:pPr>
-        <w:spacing w:after="0"/>
-        <w:ind w:firstLine="567"/>
-        <w:jc w:val="both"/>
-        <w:rPr>
-          <w:rFonts w:cs="Times New Roman"/>
-          <w:szCs w:val="28"/>
-        </w:rPr>
-      </w:pPr>
-      <w:proofErr w:type="spellStart"/>
-      <w:r>
-        <w:lastRenderedPageBreak/>
-        <w:t>OrderItemRepository</w:t>
-      </w:r>
-      <w:proofErr w:type="spellEnd"/>
-      <w:r>
-        <w:t xml:space="preserve"> — сопровождает позиции заказа и обеспечивает выборку состава документа по идентификатору заказа.</w:t>
-      </w:r>
-    </w:p>
-    <w:p>
-      <w:pPr>
-        <w:spacing w:after="0"/>
-        <w:ind w:firstLine="567"/>
-        <w:jc w:val="both"/>
-        <w:rPr>
-          <w:rFonts w:cs="Times New Roman"/>
-          <w:szCs w:val="28"/>
-        </w:rPr>
-      </w:pPr>
-      <w:proofErr w:type="spellStart"/>
-      <w:r>
-        <w:t>ProductRepository</w:t>
-      </w:r>
-      <w:proofErr w:type="spellEnd"/>
-      <w:r>
-        <w:t xml:space="preserve"> — используется для фильтрации каталога, поиска товаров и выдачи ассортимента в клиентские экраны.</w:t>
-      </w:r>
-    </w:p>
-    <w:p>
-      <w:pPr>
-        <w:spacing w:after="0"/>
-        <w:ind w:firstLine="567"/>
-        <w:jc w:val="both"/>
-        <w:rPr>
-          <w:rFonts w:cs="Times New Roman"/>
-          <w:szCs w:val="28"/>
-        </w:rPr>
-      </w:pPr>
-      <w:proofErr w:type="spellStart"/>
-      <w:r>
-        <w:t>StoreAddressRepository</w:t>
-      </w:r>
-      <w:proofErr w:type="spellEnd"/>
-      <w:r>
-        <w:t xml:space="preserve"> — выполняет выборку адресов магазинов и точек доставки, связанных с директором магазина.</w:t>
-      </w:r>
-    </w:p>
-    <w:p>
-      <w:pPr>
-        <w:spacing w:after="0"/>
-        <w:ind w:firstLine="567"/>
-        <w:jc w:val="both"/>
-        <w:rPr>
-          <w:rFonts w:cs="Times New Roman"/>
-          <w:szCs w:val="28"/>
-        </w:rPr>
-      </w:pPr>
-      <w:proofErr w:type="spellStart"/>
-      <w:r>
-        <w:t>UserRepository</w:t>
-      </w:r>
-      <w:proofErr w:type="spellEnd"/>
-      <w:r>
-        <w:t xml:space="preserve"> — используется при регистрации, поиске и сопровождении пользователей различных ролей.</w:t>
-      </w:r>
-    </w:p>
-    <w:p>
-      <w:pPr>
-        <w:spacing w:after="0"/>
-        <w:ind w:firstLine="567"/>
-        <w:jc w:val="both"/>
-        <w:rPr>
-          <w:rFonts w:cs="Times New Roman"/>
-          <w:szCs w:val="28"/>
-        </w:rPr>
-      </w:pPr>
-      <w:proofErr w:type="spellStart"/>
-      <w:r>
-        <w:t>OrderTimelineEventRepository</w:t>
-      </w:r>
-      <w:proofErr w:type="spellEnd"/>
-      <w:r>
-        <w:t xml:space="preserve"> — хранит историю изменений документа и обеспечивает последующее восстановление жизненного цикла заказа.</w:t>
-      </w:r>
-    </w:p>
-    <w:p>
-      <w:pPr>
-        <w:spacing w:after="0"/>
-        <w:ind w:firstLine="567"/>
-        <w:jc w:val="both"/>
-        <w:rPr>
-          <w:rFonts w:cs="Times New Roman"/>
-          <w:szCs w:val="28"/>
-        </w:rPr>
-      </w:pPr>
-      <w:proofErr w:type="spellStart"/>
-      <w:r>
-        <w:t>RealtimeNotificationRepository</w:t>
-      </w:r>
-      <w:proofErr w:type="spellEnd"/>
-      <w:r>
-        <w:t xml:space="preserve"> — выдаёт служебные уведомления для обновления интерфейса без ручной перезагрузки страниц.</w:t>
-      </w:r>
-    </w:p>
-    <w:p>
-      <w:pPr>
-        <w:spacing w:after="0"/>
-        <w:ind w:firstLine="567"/>
-        <w:jc w:val="both"/>
-        <w:rPr>
-          <w:rFonts w:cs="Times New Roman"/>
-          <w:szCs w:val="28"/>
-        </w:rPr>
-      </w:pPr>
-      <w:proofErr w:type="spellStart"/>
-      <w:r>
-        <w:t>StockMovementRepository</w:t>
-      </w:r>
-      <w:proofErr w:type="spellEnd"/>
-      <w:r>
-        <w:t xml:space="preserve"> — используется для служебных выборок по остаткам и аналитике движения товарных позиций.</w:t>
+      <w:r>
+        <w:t>OrderRepository — отвечает за работу с документами заказа, их поиском, фильтрацией по статусам и выдачей данных для логистики.</w:t>
+      </w:r>
+    </w:p>
+    <w:p>
+      <w:pPr>
+        <w:spacing w:after="0"/>
+        <w:ind w:firstLine="567"/>
+        <w:jc w:val="both"/>
+        <w:rPr>
+          <w:rFonts w:cs="Times New Roman"/>
+          <w:szCs w:val="28"/>
+        </w:rPr>
+      </w:pPr>
+      <w:r>
+        <w:t>OrderItemRepository — сопровождает позиции заказа и обеспечивает выборку состава документа по идентификатору заказа.</w:t>
+      </w:r>
+    </w:p>
+    <w:p>
+      <w:pPr>
+        <w:spacing w:after="0"/>
+        <w:ind w:firstLine="567"/>
+        <w:jc w:val="both"/>
+        <w:rPr>
+          <w:rFonts w:cs="Times New Roman"/>
+          <w:szCs w:val="28"/>
+        </w:rPr>
+      </w:pPr>
+      <w:r>
+        <w:t>ProductRepository — используется для фильтрации каталога, поиска товаров и выдачи ассортимента в клиентские экраны.</w:t>
+      </w:r>
+    </w:p>
+    <w:p>
+      <w:pPr>
+        <w:spacing w:after="0"/>
+        <w:ind w:firstLine="567"/>
+        <w:jc w:val="both"/>
+        <w:rPr>
+          <w:rFonts w:cs="Times New Roman"/>
+          <w:szCs w:val="28"/>
+        </w:rPr>
+      </w:pPr>
+      <w:r>
+        <w:t>StoreAddressRepository — выполняет выборку адресов магазинов и точек доставки, связанных с директором магазина.</w:t>
+      </w:r>
+    </w:p>
+    <w:p>
+      <w:pPr>
+        <w:spacing w:after="0"/>
+        <w:ind w:firstLine="567"/>
+        <w:jc w:val="both"/>
+        <w:rPr>
+          <w:rFonts w:cs="Times New Roman"/>
+          <w:szCs w:val="28"/>
+        </w:rPr>
+      </w:pPr>
+      <w:r>
+        <w:t>UserRepository — используется при регистрации, поиске и сопровождении пользователей различных ролей.</w:t>
+      </w:r>
+    </w:p>
+    <w:p>
+      <w:pPr>
+        <w:spacing w:after="0"/>
+        <w:ind w:firstLine="567"/>
+        <w:jc w:val="both"/>
+        <w:rPr>
+          <w:rFonts w:cs="Times New Roman"/>
+          <w:szCs w:val="28"/>
+        </w:rPr>
+      </w:pPr>
+      <w:r>
+        <w:t>OrderTimelineEventRepository — хранит историю изменений документа и обеспечивает последующее восстановление жизненного цикла заказа.</w:t>
+      </w:r>
+    </w:p>
+    <w:p>
+      <w:pPr>
+        <w:spacing w:after="0"/>
+        <w:ind w:firstLine="567"/>
+        <w:jc w:val="both"/>
+        <w:rPr>
+          <w:rFonts w:cs="Times New Roman"/>
+          <w:szCs w:val="28"/>
+        </w:rPr>
+      </w:pPr>
+      <w:r>
+        <w:t>RealtimeNotificationRepository — выдаёт служебные уведомления для обновления интерфейса без ручной перезагрузки страниц.</w:t>
+      </w:r>
+    </w:p>
+    <w:p>
+      <w:pPr>
+        <w:spacing w:after="0"/>
+        <w:ind w:firstLine="567"/>
+        <w:jc w:val="both"/>
+        <w:rPr>
+          <w:rFonts w:cs="Times New Roman"/>
+          <w:szCs w:val="28"/>
+        </w:rPr>
+      </w:pPr>
+      <w:r>
+        <w:t>StockMovementRepository — используется для служебных выборок по остаткам и аналитике движения товарных позиций.</w:t>
       </w:r>
     </w:p>
     <w:p>
@@ -7129,37 +6084,21 @@
         </w:rPr>
       </w:pPr>
       <w:r>
-        <w:t xml:space="preserve">Слой </w:t>
-      </w:r>
-      <w:proofErr w:type="spellStart"/>
-      <w:r>
-        <w:t>repository</w:t>
-      </w:r>
-      <w:proofErr w:type="spellEnd"/>
-      <w:r>
-        <w:t xml:space="preserve"> выступает связующим звеном между объектной моделью приложения и реальными данными, хранящимися в базе.</w:t>
-      </w:r>
-    </w:p>
-    <w:p>
-      <w:pPr>
-        <w:spacing w:after="0"/>
-        <w:ind w:firstLine="567"/>
-        <w:jc w:val="both"/>
-        <w:rPr>
-          <w:rFonts w:cs="Times New Roman"/>
-          <w:szCs w:val="28"/>
-        </w:rPr>
-      </w:pPr>
-      <w:r>
-        <w:t xml:space="preserve">Пакет </w:t>
-      </w:r>
-      <w:proofErr w:type="spellStart"/>
-      <w:r>
-        <w:t>controller</w:t>
-      </w:r>
-      <w:proofErr w:type="spellEnd"/>
-      <w:r>
-        <w:t xml:space="preserve"> содержит REST-контроллеры приложения, отвечающие за вход в систему, каталог, заказы, отчёты и вспомогательные интеграции. Контроллеры не реализуют бизнес-логику напрямую, а передают вычисления сервисному слою.</w:t>
+        <w:t>Слой repository выступает связующим звеном между объектной моделью приложения и реальными данными, хранящимися в базе.</w:t>
+      </w:r>
+    </w:p>
+    <w:p>
+      <w:pPr>
+        <w:spacing w:after="0"/>
+        <w:ind w:firstLine="567"/>
+        <w:jc w:val="both"/>
+        <w:rPr>
+          <w:rFonts w:cs="Times New Roman"/>
+          <w:szCs w:val="28"/>
+        </w:rPr>
+      </w:pPr>
+      <w:r>
+        <w:t>Пакет controller содержит REST-контроллеры приложения, отвечающие за вход в систему, каталог, заказы, отчёты и вспомогательные интеграции. Контроллеры не реализуют бизнес-логику напрямую, а передают вычисления сервисному слою.</w:t>
       </w:r>
     </w:p>
     <w:p>
@@ -7218,13 +6157,8 @@
         </w:rPr>
       </w:pPr>
       <w:r>
-        <w:t xml:space="preserve">Рисунок 2.6 – Пакет </w:t>
-      </w:r>
-      <w:proofErr w:type="spellStart"/>
-      <w:r>
-        <w:t>controller</w:t>
-      </w:r>
-      <w:proofErr w:type="spellEnd"/>
+        <w:t>Рисунок 2.6 – Пакет controller</w:t>
+      </w:r>
     </w:p>
     <w:p>
       <w:pPr>
@@ -7250,212 +6184,134 @@
           <w:szCs w:val="28"/>
         </w:rPr>
       </w:pPr>
-      <w:proofErr w:type="spellStart"/>
-      <w:r>
-        <w:t>AuthController</w:t>
-      </w:r>
-      <w:proofErr w:type="spellEnd"/>
-      <w:r>
-        <w:t xml:space="preserve"> — отвечает за авторизацию пользователя, проверку учётных данных и выдачу JWT-токена после успешного входа.</w:t>
-      </w:r>
-    </w:p>
-    <w:p>
-      <w:pPr>
-        <w:spacing w:after="0"/>
-        <w:ind w:firstLine="567"/>
-        <w:jc w:val="both"/>
-        <w:rPr>
-          <w:rFonts w:cs="Times New Roman"/>
-          <w:szCs w:val="28"/>
-        </w:rPr>
-      </w:pPr>
-      <w:proofErr w:type="spellStart"/>
-      <w:r>
-        <w:lastRenderedPageBreak/>
-        <w:t>DirectorProfileController</w:t>
-      </w:r>
-      <w:proofErr w:type="spellEnd"/>
-      <w:r>
-        <w:t xml:space="preserve"> — обслуживает профиль директора магазина, адреса доставки и данные, которые отображаются в публичном </w:t>
-      </w:r>
-      <w:proofErr w:type="spellStart"/>
-      <w:r>
-        <w:t>frontend</w:t>
-      </w:r>
-      <w:proofErr w:type="spellEnd"/>
-      <w:r>
-        <w:t>.</w:t>
-      </w:r>
-    </w:p>
-    <w:p>
-      <w:pPr>
-        <w:spacing w:after="0"/>
-        <w:ind w:firstLine="567"/>
-        <w:jc w:val="both"/>
-        <w:rPr>
-          <w:rFonts w:cs="Times New Roman"/>
-          <w:szCs w:val="28"/>
-        </w:rPr>
-      </w:pPr>
-      <w:proofErr w:type="spellStart"/>
-      <w:r>
-        <w:t>OrderController</w:t>
-      </w:r>
-      <w:proofErr w:type="spellEnd"/>
-      <w:r>
-        <w:t xml:space="preserve"> — основная точка работы с заказами, ручным и автоматическим назначением водителей, </w:t>
-      </w:r>
-      <w:proofErr w:type="spellStart"/>
-      <w:r>
-        <w:t>preview</w:t>
-      </w:r>
-      <w:proofErr w:type="spellEnd"/>
-      <w:r>
-        <w:t xml:space="preserve"> транспортной задачи и подтверждением маршрутов.</w:t>
-      </w:r>
-    </w:p>
-    <w:p>
-      <w:pPr>
-        <w:spacing w:after="0"/>
-        <w:ind w:firstLine="567"/>
-        <w:jc w:val="both"/>
-        <w:rPr>
-          <w:rFonts w:cs="Times New Roman"/>
-          <w:szCs w:val="28"/>
-        </w:rPr>
-      </w:pPr>
-      <w:proofErr w:type="spellStart"/>
-      <w:r>
-        <w:t>ProductController</w:t>
-      </w:r>
-      <w:proofErr w:type="spellEnd"/>
-      <w:r>
-        <w:t xml:space="preserve"> — сопровождает каталог продукции, фильтрацию и редактирование товарных позиций.</w:t>
-      </w:r>
-    </w:p>
-    <w:p>
-      <w:pPr>
-        <w:spacing w:after="0"/>
-        <w:ind w:firstLine="567"/>
-        <w:jc w:val="both"/>
-        <w:rPr>
-          <w:rFonts w:cs="Times New Roman"/>
-          <w:szCs w:val="28"/>
-        </w:rPr>
-      </w:pPr>
-      <w:proofErr w:type="spellStart"/>
-      <w:r>
-        <w:t>UserManagementController</w:t>
-      </w:r>
-      <w:proofErr w:type="spellEnd"/>
-      <w:r>
-        <w:t xml:space="preserve"> — используется для регистрации директоров магазинов, просмотра списка водителей и сопровождения учётных записей.</w:t>
-      </w:r>
-    </w:p>
-    <w:p>
-      <w:pPr>
-        <w:spacing w:after="0"/>
-        <w:ind w:firstLine="567"/>
-        <w:jc w:val="both"/>
-        <w:rPr>
-          <w:rFonts w:cs="Times New Roman"/>
-          <w:szCs w:val="28"/>
-        </w:rPr>
-      </w:pPr>
-      <w:proofErr w:type="spellStart"/>
-      <w:r>
-        <w:t>DashboardController</w:t>
-      </w:r>
-      <w:proofErr w:type="spellEnd"/>
-      <w:r>
-        <w:t xml:space="preserve"> — возвращает агрегированные показатели по статусам заказов и общую сводку для менеджерского интерфейса.</w:t>
-      </w:r>
-    </w:p>
-    <w:p>
-      <w:pPr>
-        <w:spacing w:after="0"/>
-        <w:ind w:firstLine="567"/>
-        <w:jc w:val="both"/>
-        <w:rPr>
-          <w:rFonts w:cs="Times New Roman"/>
-          <w:szCs w:val="28"/>
-        </w:rPr>
-      </w:pPr>
-      <w:proofErr w:type="spellStart"/>
-      <w:r>
-        <w:t>ReportController</w:t>
-      </w:r>
-      <w:proofErr w:type="spellEnd"/>
-      <w:r>
-        <w:t xml:space="preserve"> — отвечает за формирование отчётов и выгрузку данных по заказам в файл Excel.</w:t>
-      </w:r>
-    </w:p>
-    <w:p>
-      <w:pPr>
-        <w:spacing w:after="0"/>
-        <w:ind w:firstLine="567"/>
-        <w:jc w:val="both"/>
-        <w:rPr>
-          <w:rFonts w:cs="Times New Roman"/>
-          <w:szCs w:val="28"/>
-        </w:rPr>
-      </w:pPr>
-      <w:proofErr w:type="spellStart"/>
-      <w:r>
-        <w:t>NotificationController</w:t>
-      </w:r>
-      <w:proofErr w:type="spellEnd"/>
-      <w:r>
-        <w:t xml:space="preserve"> — публикует поток уведомлений и события для актуализации пользовательских экранов.</w:t>
-      </w:r>
-    </w:p>
-    <w:p>
-      <w:pPr>
-        <w:spacing w:after="0"/>
-        <w:ind w:firstLine="567"/>
-        <w:jc w:val="both"/>
-        <w:rPr>
-          <w:rFonts w:cs="Times New Roman"/>
-          <w:szCs w:val="28"/>
-        </w:rPr>
-      </w:pPr>
-      <w:proofErr w:type="spellStart"/>
-      <w:r>
-        <w:t>GeoController</w:t>
-      </w:r>
-      <w:proofErr w:type="spellEnd"/>
-      <w:r>
-        <w:t xml:space="preserve"> — выполняет </w:t>
-      </w:r>
-      <w:proofErr w:type="spellStart"/>
-      <w:r>
-        <w:t>геокодирование</w:t>
-      </w:r>
-      <w:proofErr w:type="spellEnd"/>
-      <w:r>
-        <w:t xml:space="preserve"> адресов и подготовку данных для отображения точек на карте.</w:t>
-      </w:r>
-    </w:p>
-    <w:p>
-      <w:pPr>
-        <w:spacing w:after="0"/>
-        <w:ind w:firstLine="567"/>
-        <w:jc w:val="both"/>
-        <w:rPr>
-          <w:rFonts w:cs="Times New Roman"/>
-          <w:szCs w:val="28"/>
-        </w:rPr>
-      </w:pPr>
-      <w:r>
-        <w:t xml:space="preserve">Production-конфигурация публичной версии оставляет доступными рабочие </w:t>
-      </w:r>
-      <w:proofErr w:type="spellStart"/>
-      <w:r>
-        <w:t>endpoint'ы</w:t>
-      </w:r>
-      <w:proofErr w:type="spellEnd"/>
-      <w:r>
-        <w:t xml:space="preserve"> авторизации, каталога, заказов, отчётности и маршрутизации.</w:t>
+      <w:r>
+        <w:t>AuthController — отвечает за авторизацию пользователя, проверку учётных данных и выдачу JWT-токена после успешного входа.</w:t>
+      </w:r>
+    </w:p>
+    <w:p>
+      <w:pPr>
+        <w:spacing w:after="0"/>
+        <w:ind w:firstLine="567"/>
+        <w:jc w:val="both"/>
+        <w:rPr>
+          <w:rFonts w:cs="Times New Roman"/>
+          <w:szCs w:val="28"/>
+        </w:rPr>
+      </w:pPr>
+      <w:r>
+        <w:t>DirectorProfileController — обслуживает профиль директора магазина, адреса доставки и данные, которые отображаются в публичном frontend.</w:t>
+      </w:r>
+    </w:p>
+    <w:p>
+      <w:pPr>
+        <w:spacing w:after="0"/>
+        <w:ind w:firstLine="567"/>
+        <w:jc w:val="both"/>
+        <w:rPr>
+          <w:rFonts w:cs="Times New Roman"/>
+          <w:szCs w:val="28"/>
+        </w:rPr>
+      </w:pPr>
+      <w:r>
+        <w:t>OrderController — основная точка работы с заказами, ручным и автоматическим назначением водителей, preview транспортной задачи и подтверждением маршрутов.</w:t>
+      </w:r>
+    </w:p>
+    <w:p>
+      <w:pPr>
+        <w:spacing w:after="0"/>
+        <w:ind w:firstLine="567"/>
+        <w:jc w:val="both"/>
+        <w:rPr>
+          <w:rFonts w:cs="Times New Roman"/>
+          <w:szCs w:val="28"/>
+        </w:rPr>
+      </w:pPr>
+      <w:r>
+        <w:t>ProductController — сопровождает каталог продукции, фильтрацию и редактирование товарных позиций.</w:t>
+      </w:r>
+    </w:p>
+    <w:p>
+      <w:pPr>
+        <w:spacing w:after="0"/>
+        <w:ind w:firstLine="567"/>
+        <w:jc w:val="both"/>
+        <w:rPr>
+          <w:rFonts w:cs="Times New Roman"/>
+          <w:szCs w:val="28"/>
+        </w:rPr>
+      </w:pPr>
+      <w:r>
+        <w:t>UserManagementController — используется для регистрации директоров магазинов, просмотра списка водителей и сопровождения учётных записей.</w:t>
+      </w:r>
+    </w:p>
+    <w:p>
+      <w:pPr>
+        <w:spacing w:after="0"/>
+        <w:ind w:firstLine="567"/>
+        <w:jc w:val="both"/>
+        <w:rPr>
+          <w:rFonts w:cs="Times New Roman"/>
+          <w:szCs w:val="28"/>
+        </w:rPr>
+      </w:pPr>
+      <w:r>
+        <w:t>DashboardController — возвращает агрегированные показатели по статусам заказов и общую сводку для менеджерского интерфейса.</w:t>
+      </w:r>
+    </w:p>
+    <w:p>
+      <w:pPr>
+        <w:spacing w:after="0"/>
+        <w:ind w:firstLine="567"/>
+        <w:jc w:val="both"/>
+        <w:rPr>
+          <w:rFonts w:cs="Times New Roman"/>
+          <w:szCs w:val="28"/>
+        </w:rPr>
+      </w:pPr>
+      <w:r>
+        <w:t>ReportController — отвечает за формирование отчётов и выгрузку данных по заказам в файл Excel.</w:t>
+      </w:r>
+    </w:p>
+    <w:p>
+      <w:pPr>
+        <w:spacing w:after="0"/>
+        <w:ind w:firstLine="567"/>
+        <w:jc w:val="both"/>
+        <w:rPr>
+          <w:rFonts w:cs="Times New Roman"/>
+          <w:szCs w:val="28"/>
+        </w:rPr>
+      </w:pPr>
+      <w:r>
+        <w:t>NotificationController — публикует поток уведомлений и события для актуализации пользовательских экранов.</w:t>
+      </w:r>
+    </w:p>
+    <w:p>
+      <w:pPr>
+        <w:spacing w:after="0"/>
+        <w:ind w:firstLine="567"/>
+        <w:jc w:val="both"/>
+        <w:rPr>
+          <w:rFonts w:cs="Times New Roman"/>
+          <w:szCs w:val="28"/>
+        </w:rPr>
+      </w:pPr>
+      <w:r>
+        <w:t>GeoController — выполняет геокодирование адресов и подготовку данных для отображения точек на карте.</w:t>
+      </w:r>
+    </w:p>
+    <w:p>
+      <w:pPr>
+        <w:spacing w:after="0"/>
+        <w:ind w:firstLine="567"/>
+        <w:jc w:val="both"/>
+        <w:rPr>
+          <w:rFonts w:cs="Times New Roman"/>
+          <w:szCs w:val="28"/>
+        </w:rPr>
+      </w:pPr>
+      <w:r>
+        <w:t>Production-конфигурация публичной версии оставляет доступными рабочие endpoint'ы авторизации, каталога, заказов, отчётности и маршрутизации.</w:t>
       </w:r>
     </w:p>
     <w:p>
@@ -7483,39 +6339,7 @@
         </w:rPr>
       </w:pPr>
       <w:r>
-        <w:t xml:space="preserve">Пакеты </w:t>
-      </w:r>
-      <w:proofErr w:type="spellStart"/>
-      <w:r>
-        <w:t>config</w:t>
-      </w:r>
-      <w:proofErr w:type="spellEnd"/>
-      <w:r>
-        <w:t xml:space="preserve"> и </w:t>
-      </w:r>
-      <w:proofErr w:type="spellStart"/>
-      <w:r>
-        <w:t>security</w:t>
-      </w:r>
-      <w:proofErr w:type="spellEnd"/>
-      <w:r>
-        <w:t xml:space="preserve"> содержат механизмы безопасности и конфигурации проекта. Здесь описаны правила доступа к </w:t>
-      </w:r>
-      <w:proofErr w:type="spellStart"/>
-      <w:r>
-        <w:t>эндпоинтам</w:t>
-      </w:r>
-      <w:proofErr w:type="spellEnd"/>
-      <w:r>
-        <w:t xml:space="preserve">, настройки JWT, CORS и </w:t>
-      </w:r>
-      <w:proofErr w:type="spellStart"/>
-      <w:r>
-        <w:t>production</w:t>
-      </w:r>
-      <w:proofErr w:type="spellEnd"/>
-      <w:r>
-        <w:t>-профиль публичной версии.</w:t>
+        <w:t>Пакеты config и security содержат механизмы безопасности и конфигурации проекта. Здесь описаны правила доступа к эндпоинтам, настройки JWT, CORS и production-профиль публичной версии.</w:t>
       </w:r>
     </w:p>
     <w:p>
@@ -7574,34 +6398,20 @@
         </w:rPr>
       </w:pPr>
       <w:r>
-        <w:t xml:space="preserve">Рисунок 2.7 – Пакеты </w:t>
-      </w:r>
-      <w:proofErr w:type="spellStart"/>
-      <w:r>
-        <w:t>config</w:t>
-      </w:r>
-      <w:proofErr w:type="spellEnd"/>
-      <w:r>
-        <w:t xml:space="preserve"> и </w:t>
-      </w:r>
-      <w:proofErr w:type="spellStart"/>
-      <w:r>
-        <w:t>security</w:t>
-      </w:r>
-      <w:proofErr w:type="spellEnd"/>
-    </w:p>
-    <w:p>
-      <w:pPr>
-        <w:spacing w:after="0"/>
-        <w:ind w:firstLine="567"/>
-        <w:jc w:val="both"/>
-        <w:rPr>
-          <w:rFonts w:cs="Times New Roman"/>
-          <w:szCs w:val="28"/>
-        </w:rPr>
-      </w:pPr>
-      <w:r>
-        <w:lastRenderedPageBreak/>
+        <w:t>Рисунок 2.7 – Пакеты config и security</w:t>
+      </w:r>
+    </w:p>
+    <w:p>
+      <w:pPr>
+        <w:spacing w:after="0"/>
+        <w:ind w:firstLine="567"/>
+        <w:jc w:val="both"/>
+        <w:rPr>
+          <w:rFonts w:cs="Times New Roman"/>
+          <w:szCs w:val="28"/>
+        </w:rPr>
+      </w:pPr>
+      <w:r>
         <w:t>За счёт этих пакетов в системе реализуются защита API, привязка ролей к запросам, настройка CORS и профилей окружения, а также выпуск JWT-токенов для клиента.</w:t>
       </w:r>
     </w:p>
@@ -7630,15 +6440,7 @@
         </w:rPr>
       </w:pPr>
       <w:r>
-        <w:t xml:space="preserve">Отдельные правила маршрутизации сопоставляют </w:t>
-      </w:r>
-      <w:proofErr w:type="spellStart"/>
-      <w:r>
-        <w:t>эндпоинты</w:t>
-      </w:r>
-      <w:proofErr w:type="spellEnd"/>
-      <w:r>
-        <w:t xml:space="preserve"> API с разрешёнными ролями пользователей.</w:t>
+        <w:t>Отдельные правила маршрутизации сопоставляют эндпоинты API с разрешёнными ролями пользователей.</w:t>
       </w:r>
     </w:p>
     <w:p>
@@ -7666,45 +6468,21 @@
         </w:rPr>
       </w:pPr>
       <w:r>
-        <w:t xml:space="preserve">Дополнительно конфигурационные пакеты задают </w:t>
-      </w:r>
-      <w:proofErr w:type="spellStart"/>
-      <w:r>
-        <w:t>production-defaults</w:t>
-      </w:r>
-      <w:proofErr w:type="spellEnd"/>
-      <w:r>
-        <w:t>: служебные сценарии выключены, каталог может наполняться при запуске, а CORS разрешает публичный домен сайта.</w:t>
-      </w:r>
-    </w:p>
-    <w:p>
-      <w:pPr>
-        <w:spacing w:after="0"/>
-        <w:ind w:firstLine="567"/>
-        <w:jc w:val="both"/>
-        <w:rPr>
-          <w:rFonts w:cs="Times New Roman"/>
-          <w:szCs w:val="28"/>
-        </w:rPr>
-      </w:pPr>
-      <w:r>
-        <w:t xml:space="preserve">Во </w:t>
-      </w:r>
-      <w:proofErr w:type="spellStart"/>
-      <w:r>
-        <w:t>frontend</w:t>
-      </w:r>
-      <w:proofErr w:type="spellEnd"/>
-      <w:r>
-        <w:t xml:space="preserve"> роль директора реализована в файле </w:t>
-      </w:r>
-      <w:proofErr w:type="spellStart"/>
-      <w:r>
-        <w:t>DirectorView.jsx</w:t>
-      </w:r>
-      <w:proofErr w:type="spellEnd"/>
-      <w:r>
-        <w:t>. Этот модуль объединяет профиль, адреса, каталог, корзину и историю заказов, а также использует карту для выбора точки доставки.</w:t>
+        <w:t>Дополнительно конфигурационные пакеты задают production-defaults: служебные сценарии выключены, каталог может наполняться при запуске, а CORS разрешает публичный домен сайта.</w:t>
+      </w:r>
+    </w:p>
+    <w:p>
+      <w:pPr>
+        <w:spacing w:after="0"/>
+        <w:ind w:firstLine="567"/>
+        <w:jc w:val="both"/>
+        <w:rPr>
+          <w:rFonts w:cs="Times New Roman"/>
+          <w:szCs w:val="28"/>
+        </w:rPr>
+      </w:pPr>
+      <w:r>
+        <w:t>Во frontend роль директора реализована в файле DirectorView.jsx. Этот модуль объединяет профиль, адреса, каталог, корзину и историю заказов, а также использует карту для выбора точки доставки.</w:t>
       </w:r>
     </w:p>
     <w:p>
@@ -7763,13 +6541,8 @@
         </w:rPr>
       </w:pPr>
       <w:r>
-        <w:t xml:space="preserve">Рисунок 2.8 – Директорский модуль </w:t>
-      </w:r>
-      <w:proofErr w:type="spellStart"/>
-      <w:r>
-        <w:t>frontend</w:t>
-      </w:r>
-      <w:proofErr w:type="spellEnd"/>
+        <w:t>Рисунок 2.8 – Директорский модуль frontend</w:t>
+      </w:r>
     </w:p>
     <w:p>
       <w:pPr>
@@ -7852,24 +6625,7 @@
         </w:rPr>
       </w:pPr>
       <w:r>
-        <w:lastRenderedPageBreak/>
-        <w:t xml:space="preserve">Менеджерский модуль собран вокруг файла </w:t>
-      </w:r>
-      <w:proofErr w:type="spellStart"/>
-      <w:r>
-        <w:t>ManagerView.jsx</w:t>
-      </w:r>
-      <w:proofErr w:type="spellEnd"/>
-      <w:r>
-        <w:t xml:space="preserve">. В нём реализованы сводка по системе, </w:t>
-      </w:r>
-      <w:proofErr w:type="spellStart"/>
-      <w:r>
-        <w:t>kanban</w:t>
-      </w:r>
-      <w:proofErr w:type="spellEnd"/>
-      <w:r>
-        <w:t>-представление статусов заявок, сопровождение каталога, регистрация пользователей и выгрузка Excel-отчётов.</w:t>
+        <w:t>Менеджерский модуль собран вокруг файла ManagerView.jsx. В нём реализованы сводка по системе, kanban-представление статусов заявок, сопровождение каталога, регистрация пользователей и выгрузка Excel-отчётов.</w:t>
       </w:r>
     </w:p>
     <w:p>
@@ -7928,13 +6684,8 @@
         </w:rPr>
       </w:pPr>
       <w:r>
-        <w:t xml:space="preserve">Рисунок 2.9 – Менеджерский модуль </w:t>
-      </w:r>
-      <w:proofErr w:type="spellStart"/>
-      <w:r>
-        <w:t>frontend</w:t>
-      </w:r>
-      <w:proofErr w:type="spellEnd"/>
+        <w:t>Рисунок 2.9 – Менеджерский модуль frontend</w:t>
+      </w:r>
     </w:p>
     <w:p>
       <w:pPr>
@@ -7960,13 +6711,8 @@
           <w:szCs w:val="28"/>
         </w:rPr>
       </w:pPr>
-      <w:proofErr w:type="spellStart"/>
-      <w:r>
-        <w:t>Dashboard</w:t>
-      </w:r>
-      <w:proofErr w:type="spellEnd"/>
-      <w:r>
-        <w:t xml:space="preserve"> отображает сводную статистику и показатели по заказам.</w:t>
+      <w:r>
+        <w:t>Dashboard отображает сводную статистику и показатели по заказам.</w:t>
       </w:r>
     </w:p>
     <w:p>
@@ -8036,15 +6782,7 @@
         </w:rPr>
       </w:pPr>
       <w:r>
-        <w:t xml:space="preserve">Водительский сценарий сосредоточен в файле </w:t>
-      </w:r>
-      <w:proofErr w:type="spellStart"/>
-      <w:r>
-        <w:t>DriverView.jsx</w:t>
-      </w:r>
-      <w:proofErr w:type="spellEnd"/>
-      <w:r>
-        <w:t>. На экране водителя отображаются только назначенные ему точки маршрута, последовательность доставок и кнопки завершения заказов.</w:t>
+        <w:t>Водительский сценарий сосредоточен в файле DriverView.jsx. На экране водителя отображаются только назначенные ему точки маршрута, последовательность доставок и кнопки завершения заказов.</w:t>
       </w:r>
     </w:p>
     <w:p>
@@ -8056,7 +6794,6 @@
         <w:rPr>
           <w:noProof/>
         </w:rPr>
-        <w:lastRenderedPageBreak/>
         <w:drawing>
           <wp:inline distT="0" distB="0" distL="0" distR="0" wp14:anchorId="077967C7" wp14:editId="578EE022">
             <wp:extent cx="5184000" cy="2916000"/>
@@ -8104,13 +6841,8 @@
         </w:rPr>
       </w:pPr>
       <w:r>
-        <w:t xml:space="preserve">Рисунок 2.10 – Водительский модуль </w:t>
-      </w:r>
-      <w:proofErr w:type="spellStart"/>
-      <w:r>
-        <w:t>frontend</w:t>
-      </w:r>
-      <w:proofErr w:type="spellEnd"/>
+        <w:t>Рисунок 2.10 – Водительский модуль frontend</w:t>
+      </w:r>
     </w:p>
     <w:p>
       <w:pPr>
@@ -8224,13 +6956,8 @@
         </w:rPr>
       </w:pPr>
       <w:r>
-        <w:t xml:space="preserve">Рисунок 2.11 – Логистический модуль </w:t>
-      </w:r>
-      <w:proofErr w:type="spellStart"/>
-      <w:r>
-        <w:t>frontend</w:t>
-      </w:r>
-      <w:proofErr w:type="spellEnd"/>
+        <w:t>Рисунок 2.11 – Логистический модуль frontend</w:t>
+      </w:r>
     </w:p>
     <w:p>
       <w:pPr>
@@ -8257,7 +6984,6 @@
         </w:rPr>
       </w:pPr>
       <w:r>
-        <w:lastRenderedPageBreak/>
         <w:t>Пользователь выбирает водителей, которые будут участвовать в расчёте транспортной задачи.</w:t>
       </w:r>
     </w:p>
@@ -8272,15 +6998,7 @@
         </w:rPr>
       </w:pPr>
       <w:r>
-        <w:t xml:space="preserve">Далее система строит </w:t>
-      </w:r>
-      <w:proofErr w:type="spellStart"/>
-      <w:r>
-        <w:t>preview</w:t>
-      </w:r>
-      <w:proofErr w:type="spellEnd"/>
-      <w:r>
-        <w:t xml:space="preserve"> транспортной задачи без записи данных в базу.</w:t>
+        <w:t>Далее система строит preview транспортной задачи без записи данных в базу.</w:t>
       </w:r>
     </w:p>
     <w:p>
@@ -8322,45 +7040,21 @@
         </w:rPr>
       </w:pPr>
       <w:r>
-        <w:t xml:space="preserve">Ключевое достоинство логистического модуля заключается в разделении режимов </w:t>
-      </w:r>
-      <w:proofErr w:type="spellStart"/>
-      <w:r>
-        <w:t>preview</w:t>
-      </w:r>
-      <w:proofErr w:type="spellEnd"/>
-      <w:r>
-        <w:t xml:space="preserve"> и </w:t>
-      </w:r>
-      <w:proofErr w:type="spellStart"/>
-      <w:r>
-        <w:t>commit</w:t>
-      </w:r>
-      <w:proofErr w:type="spellEnd"/>
-      <w:r>
-        <w:t>: сначала пользователь видит безопасный предварительный расчёт с картой и сводной нагрузкой, и только после подтверждения назначение водителей фиксируется в базе данных.</w:t>
-      </w:r>
-    </w:p>
-    <w:p>
-      <w:pPr>
-        <w:spacing w:after="0"/>
-        <w:ind w:firstLine="567"/>
-        <w:jc w:val="both"/>
-        <w:rPr>
-          <w:rFonts w:cs="Times New Roman"/>
-          <w:szCs w:val="28"/>
-        </w:rPr>
-      </w:pPr>
-      <w:r>
-        <w:t xml:space="preserve">Общие API, компоненты и эксплуатационные скрипты вынесены в отдельные общие модули. Это позволяет повторно использовать сетевую логику, элементы навигации и </w:t>
-      </w:r>
-      <w:proofErr w:type="spellStart"/>
-      <w:r>
-        <w:t>deploy</w:t>
-      </w:r>
-      <w:proofErr w:type="spellEnd"/>
-      <w:r>
-        <w:t>-настройки между всеми ролями приложения.</w:t>
+        <w:t>Ключевое достоинство логистического модуля заключается в разделении режимов preview и commit: сначала пользователь видит безопасный предварительный расчёт с картой и сводной нагрузкой, и только после подтверждения назначение водителей фиксируется в базе данных.</w:t>
+      </w:r>
+    </w:p>
+    <w:p>
+      <w:pPr>
+        <w:spacing w:after="0"/>
+        <w:ind w:firstLine="567"/>
+        <w:jc w:val="both"/>
+        <w:rPr>
+          <w:rFonts w:cs="Times New Roman"/>
+          <w:szCs w:val="28"/>
+        </w:rPr>
+      </w:pPr>
+      <w:r>
+        <w:t>Общие API, компоненты и эксплуатационные скрипты вынесены в отдельные общие модули. Это позволяет повторно использовать сетевую логику, элементы навигации и deploy-настройки между всеми ролями приложения.</w:t>
       </w:r>
     </w:p>
     <w:p>
@@ -8419,50 +7113,21 @@
         </w:rPr>
       </w:pPr>
       <w:r>
-        <w:t xml:space="preserve">Рисунок 2.12 – Общие модули </w:t>
-      </w:r>
-      <w:proofErr w:type="spellStart"/>
-      <w:r>
-        <w:t>frontend</w:t>
-      </w:r>
-      <w:proofErr w:type="spellEnd"/>
-      <w:r>
-        <w:t xml:space="preserve"> и </w:t>
-      </w:r>
-      <w:proofErr w:type="spellStart"/>
-      <w:r>
-        <w:t>scripts</w:t>
-      </w:r>
-      <w:proofErr w:type="spellEnd"/>
-    </w:p>
-    <w:p>
-      <w:pPr>
-        <w:spacing w:after="0"/>
-        <w:ind w:firstLine="567"/>
-        <w:jc w:val="both"/>
-        <w:rPr>
-          <w:rFonts w:cs="Times New Roman"/>
-          <w:szCs w:val="28"/>
-        </w:rPr>
-      </w:pPr>
-      <w:r>
-        <w:t xml:space="preserve">Такое разделение упрощает сопровождение проекта: </w:t>
-      </w:r>
-      <w:proofErr w:type="spellStart"/>
-      <w:r>
-        <w:t>backend</w:t>
-      </w:r>
-      <w:proofErr w:type="spellEnd"/>
-      <w:r>
-        <w:t xml:space="preserve">, </w:t>
-      </w:r>
-      <w:proofErr w:type="spellStart"/>
-      <w:r>
-        <w:t>frontend</w:t>
-      </w:r>
-      <w:proofErr w:type="spellEnd"/>
-      <w:r>
-        <w:t xml:space="preserve"> и сценарии защиты можно развивать независимо, при этом пользовательские потоки остаются согласованными.</w:t>
+        <w:t>Рисунок 2.12 – Общие модули frontend и scripts</w:t>
+      </w:r>
+    </w:p>
+    <w:p>
+      <w:pPr>
+        <w:spacing w:after="0"/>
+        <w:ind w:firstLine="567"/>
+        <w:jc w:val="both"/>
+        <w:rPr>
+          <w:rFonts w:cs="Times New Roman"/>
+          <w:szCs w:val="28"/>
+        </w:rPr>
+      </w:pPr>
+      <w:r>
+        <w:t>Такое разделение упрощает сопровождение проекта: backend, frontend и сценарии защиты можно развивать независимо, при этом пользовательские потоки остаются согласованными.</w:t>
       </w:r>
     </w:p>
     <w:p>
@@ -8498,10 +7163,6 @@
         <w:spacing w:after="0"/>
         <w:ind w:firstLine="567"/>
         <w:jc w:val="both"/>
-        <w:rPr>
-          <w:rFonts w:cs="Times New Roman"/>
-          <w:szCs w:val="28"/>
-        </w:rPr>
       </w:pPr>
       <w:r>
         <w:t>Deploy-конфигурация и сценарии подготовки отчётных данных также расположены в общем слое проекта.</w:t>
@@ -8509,15 +7170,27 @@
     </w:p>
     <w:p>
       <w:pPr>
-        <w:spacing w:after="0"/>
-        <w:ind w:firstLine="567"/>
-        <w:jc w:val="both"/>
-        <w:rPr>
-          <w:rFonts w:cs="Times New Roman"/>
-          <w:szCs w:val="28"/>
-        </w:rPr>
-      </w:pPr>
-      <w:r>
+        <w:pStyle w:val="1"/>
+        <w:tabs>
+          <w:tab w:val="left" w:pos="1554"/>
+        </w:tabs>
+        <w:spacing w:before="0" w:after="0" w:line="320" w:lineRule="exact"/>
+        <w:jc w:val="both"/>
+        <w:rPr>
+          <w:rFonts w:eastAsiaTheme="minorHAnsi" w:cstheme="minorBidi"/>
+          <w:b w:val="0"/>
+          <w:bCs w:val="0"/>
+          <w:szCs w:val="22"/>
+        </w:rPr>
+      </w:pPr>
+      <w:bookmarkStart w:id="6" w:name="_Toc227879197"/>
+      <w:r>
+        <w:rPr>
+          <w:rFonts w:eastAsiaTheme="minorHAnsi" w:cstheme="minorBidi"/>
+          <w:b w:val="0"/>
+          <w:bCs w:val="0"/>
+          <w:szCs w:val="22"/>
+        </w:rPr>
         <w:t>Дополнительные эксплуатационные файлы используются для публичного развёртывания и проверки задеплоенной версии.</w:t>
       </w:r>
     </w:p>
@@ -8530,9 +7203,7 @@
         <w:spacing w:before="0" w:after="0" w:line="320" w:lineRule="exact"/>
         <w:jc w:val="both"/>
       </w:pPr>
-      <w:bookmarkStart w:id="6" w:name="_Toc227879197"/>
-      <w:r>
-        <w:lastRenderedPageBreak/>
+      <w:r>
         <w:t>2.3 Результат работы программы</w:t>
       </w:r>
       <w:bookmarkEnd w:id="6"/>
@@ -8615,10 +7286,6 @@
         <w:spacing w:after="0"/>
         <w:ind w:firstLine="567"/>
         <w:jc w:val="both"/>
-        <w:rPr>
-          <w:rFonts w:cs="Times New Roman"/>
-          <w:szCs w:val="28"/>
-        </w:rPr>
       </w:pPr>
       <w:r>
         <w:t>Контрольная проверка проекта выполнялась через публичную версию сайта https://farmer.indevs.in. Статическая клиентская часть обращается к backend API https://farm-sales-backend.onrender.com/api, где работают авторизация, каталог, заказы, отчёты и логистические расчёты. После выполнения сценария reset публичный API содержит 30 адресов магазинов, каталог из 200 товарных позиций и 30 заказов; все 30 заказов находятся в статусе APPROVED.</w:t>
@@ -8627,12 +7294,7 @@
     <w:p>
       <w:pPr>
         <w:spacing w:after="0"/>
-        <w:ind w:firstLine="567"/>
-        <w:jc w:val="both"/>
-        <w:rPr>
-          <w:rFonts w:cs="Times New Roman"/>
-          <w:szCs w:val="28"/>
-        </w:rPr>
+        <w:jc w:val="center"/>
       </w:pPr>
       <w:r>
         <w:t>После reset логист открывает модуль назначений и запускает preview транспортной задачи. Система видит 30 заказов в статусе APPROVED, группирует их по 30 точкам доставки и готовит план распределения между водителями с учётом веса, объёма и дорожного километража.</w:t>
@@ -8647,7 +7309,6 @@
         <w:rPr>
           <w:noProof/>
         </w:rPr>
-        <w:lastRenderedPageBreak/>
         <w:drawing>
           <wp:inline distT="0" distB="0" distL="0" distR="0" wp14:anchorId="0377640C" wp14:editId="1645CFF1">
             <wp:extent cx="4968000" cy="3415500"/>
@@ -8687,26 +7348,30 @@
     </w:p>
     <w:p>
       <w:pPr>
-        <w:pStyle w:val="af7"/>
-        <w:ind w:firstLine="567"/>
+        <w:spacing w:after="0"/>
+        <w:ind w:firstLine="567"/>
+        <w:jc w:val="both"/>
+        <w:rPr>
+          <w:rFonts w:eastAsia="Times New Roman" w:cs="Times New Roman"/>
+          <w:kern w:val="0"/>
+          <w:szCs w:val="28"/>
+          <w14:ligatures w14:val="none"/>
+        </w:rPr>
+      </w:pPr>
+      <w:r>
+        <w:rPr>
+          <w:rFonts w:eastAsia="Times New Roman" w:cs="Times New Roman"/>
+          <w:kern w:val="0"/>
+          <w:szCs w:val="28"/>
+          <w14:ligatures w14:val="none"/>
+        </w:rPr>
+        <w:t>Рисунок 2.14 – Preview транспортного модуля для 30 заказов</w:t>
+      </w:r>
+    </w:p>
+    <w:p>
+      <w:pPr>
+        <w:spacing w:after="0"/>
         <w:jc w:val="center"/>
-        <w:rPr>
-          <w:spacing w:val="-2"/>
-        </w:rPr>
-      </w:pPr>
-      <w:r>
-        <w:t>Рисунок 2.14 – Preview транспортного модуля для 30 заказов</w:t>
-      </w:r>
-    </w:p>
-    <w:p>
-      <w:pPr>
-        <w:spacing w:after="0"/>
-        <w:ind w:firstLine="567"/>
-        <w:jc w:val="both"/>
-        <w:rPr>
-          <w:rFonts w:cs="Times New Roman"/>
-          <w:szCs w:val="28"/>
-        </w:rPr>
       </w:pPr>
       <w:r>
         <w:t>Сводка по маршрутам показывает распределение базового набора между водителями, количество рейсов, последовательность остановок и оценочный километраж. После подтверждения плана заказы переходят из APPROVED в ASSIGNED, а водительский интерфейс получает назначенные доставки.</w:t>
@@ -8782,7 +7447,6 @@
       </w:pPr>
       <w:bookmarkStart w:id="7" w:name="_Toc227879198"/>
       <w:r>
-        <w:lastRenderedPageBreak/>
         <w:t>3 Инструкция по пользованию проектом</w:t>
       </w:r>
       <w:bookmarkEnd w:id="7"/>
@@ -8798,23 +7462,7 @@
         </w:rPr>
       </w:pPr>
       <w:r>
-        <w:t xml:space="preserve">Для начала работы необходимо открыть публичную версию сайта по адресу https://farmer.indevs.in. Пользователь взаимодействует только с </w:t>
-      </w:r>
-      <w:proofErr w:type="spellStart"/>
-      <w:r>
-        <w:t>web</w:t>
-      </w:r>
-      <w:proofErr w:type="spellEnd"/>
-      <w:r>
-        <w:t xml:space="preserve">-интерфейсом, а серверная часть и база данных работают на удалённом </w:t>
-      </w:r>
-      <w:proofErr w:type="spellStart"/>
-      <w:r>
-        <w:t>backend</w:t>
-      </w:r>
-      <w:proofErr w:type="spellEnd"/>
-      <w:r>
-        <w:t>-контуре (рисунок 3.1).</w:t>
+        <w:t>Для начала работы необходимо открыть публичную версию сайта по адресу https://farmer.indevs.in. Пользователь взаимодействует только с web-интерфейсом, а серверная часть и база данных работают на удалённом backend-контуре (рисунок 3.1).</w:t>
       </w:r>
     </w:p>
     <w:p>
@@ -8960,11 +7608,7 @@
         </w:rPr>
       </w:pPr>
       <w:r>
-        <w:t xml:space="preserve">После успешного входа директор магазина попадает в свой личный кабинет, где может проверить контактные данные, статистику по заказам и текущую </w:t>
-      </w:r>
-      <w:r>
-        <w:lastRenderedPageBreak/>
-        <w:t>активность. При необходимости на этом же экране редактируются профильные сведения (рисунок 3.3).</w:t>
+        <w:t>После успешного входа директор магазина попадает в свой личный кабинет, где может проверить контактные данные, статистику по заказам и текущую активность. При необходимости на этом же экране редактируются профильные сведения (рисунок 3.3).</w:t>
       </w:r>
     </w:p>
     <w:p>
@@ -9110,7 +7754,6 @@
         </w:rPr>
       </w:pPr>
       <w:r>
-        <w:lastRenderedPageBreak/>
         <w:t>После этого директор переходит в каталог фермерской продукции, выбирает позиции, указывает количество и формирует заявку. Система сразу отображает итоговую сумму заказа и состояние корзины (рисунок 3.5).</w:t>
       </w:r>
     </w:p>
@@ -9257,11 +7900,7 @@
         </w:rPr>
       </w:pPr>
       <w:r>
-        <w:t xml:space="preserve">Следующим участником процесса является менеджер. После входа под своей учётной записью он получает доступ к обзорной панели системы, где отображаются </w:t>
-      </w:r>
-      <w:r>
-        <w:lastRenderedPageBreak/>
-        <w:t>показатели по статусам заказов и вспомогательные виджеты аналитики (рисунок 3.7).</w:t>
+        <w:t>Следующим участником процесса является менеджер. После входа под своей учётной записью он получает доступ к обзорной панели системы, где отображаются показатели по статусам заказов и вспомогательные виджеты аналитики (рисунок 3.7).</w:t>
       </w:r>
     </w:p>
     <w:p>
@@ -9419,7 +8058,6 @@
         <w:rPr>
           <w:noProof/>
         </w:rPr>
-        <w:lastRenderedPageBreak/>
         <w:drawing>
           <wp:inline distT="0" distB="0" distL="0" distR="0" wp14:anchorId="1E7CED75" wp14:editId="39AE6A7C">
             <wp:extent cx="4968000" cy="3415500"/>
@@ -9552,7 +8190,6 @@
         <w:rPr>
           <w:noProof/>
         </w:rPr>
-        <w:lastRenderedPageBreak/>
         <w:drawing>
           <wp:inline distT="0" distB="0" distL="0" distR="0" wp14:anchorId="2A67E6B3" wp14:editId="6F0A1F84">
             <wp:extent cx="4968000" cy="3415500"/>
@@ -9687,11 +8324,7 @@
         </w:rPr>
       </w:pPr>
       <w:r>
-        <w:t xml:space="preserve">Когда в системе появляются новые заявки в статусе APPROVED, логист запускает транспортную задачу из этого же раздела. В текущем публичном состоянии таких заявок нет, потому что 29 заказов уже назначены водителям, а 3 </w:t>
-      </w:r>
-      <w:r>
-        <w:lastRenderedPageBreak/>
-        <w:t>завершены; экран показывает недоступность повторного расчёта для пустой очереди (рисунок 3.13).</w:t>
+        <w:t>Когда в системе появляются новые заявки в статусе APPROVED, логист запускает транспортную задачу из этого же раздела. В текущем публичном состоянии таких заявок нет, потому что 29 заказов уже назначены водителям, а 3 завершены; экран показывает недоступность повторного расчёта для пустой очереди (рисунок 3.13).</w:t>
       </w:r>
     </w:p>
     <w:p>
@@ -9823,26 +8456,20 @@
         </w:rPr>
       </w:pPr>
       <w:r>
-        <w:t xml:space="preserve">Рисунок 3.14 – Транспортный модуль без новых заказов для </w:t>
-      </w:r>
-      <w:proofErr w:type="spellStart"/>
-      <w:r>
-        <w:t>preview</w:t>
-      </w:r>
-      <w:proofErr w:type="spellEnd"/>
-    </w:p>
-    <w:p>
-      <w:pPr>
-        <w:spacing w:after="0"/>
-        <w:ind w:firstLine="567"/>
-        <w:jc w:val="both"/>
-        <w:rPr>
-          <w:rFonts w:cs="Times New Roman"/>
-          <w:szCs w:val="28"/>
-        </w:rPr>
-      </w:pPr>
-      <w:r>
-        <w:lastRenderedPageBreak/>
+        <w:t>Рисунок 3.14 – Транспортный модуль без новых заказов для preview</w:t>
+      </w:r>
+    </w:p>
+    <w:p>
+      <w:pPr>
+        <w:spacing w:after="0"/>
+        <w:ind w:firstLine="567"/>
+        <w:jc w:val="both"/>
+        <w:rPr>
+          <w:rFonts w:cs="Times New Roman"/>
+          <w:szCs w:val="28"/>
+        </w:rPr>
+      </w:pPr>
+      <w:r>
         <w:t>После завершения этапа логистического распределения водитель входит в систему под своей учётной записью. В его панели управления отображаются все закреплённые точки маршрута, адреса, параметры заказов и кнопки завершения доставки (рисунок 3.15).</w:t>
       </w:r>
     </w:p>
@@ -9989,7 +8616,6 @@
       </w:pPr>
       <w:bookmarkStart w:id="8" w:name="_Toc227879199"/>
       <w:r>
-        <w:lastRenderedPageBreak/>
         <w:t>Заключение</w:t>
       </w:r>
       <w:bookmarkEnd w:id="8"/>
@@ -10019,31 +8645,7 @@
         </w:rPr>
       </w:pPr>
       <w:r>
-        <w:t xml:space="preserve">Использование технологий Java 21, Spring Boot, </w:t>
-      </w:r>
-      <w:proofErr w:type="spellStart"/>
-      <w:r>
-        <w:t>React</w:t>
-      </w:r>
-      <w:proofErr w:type="spellEnd"/>
-      <w:r>
-        <w:t xml:space="preserve">, </w:t>
-      </w:r>
-      <w:proofErr w:type="spellStart"/>
-      <w:r>
-        <w:t>Vite</w:t>
-      </w:r>
-      <w:proofErr w:type="spellEnd"/>
-      <w:r>
-        <w:t xml:space="preserve"> и </w:t>
-      </w:r>
-      <w:proofErr w:type="spellStart"/>
-      <w:r>
-        <w:t>PostgreSQL</w:t>
-      </w:r>
-      <w:proofErr w:type="spellEnd"/>
-      <w:r>
-        <w:t xml:space="preserve"> позволило создать понятный интерфейс и надёжную серверную часть, обеспечивающую высокую производительность и безопасность данных. В проекте реализована модульная структура, облегчающая дальнейшее сопровождение и расширение функциональности.</w:t>
+        <w:t>Использование технологий Java 21, Spring Boot, React, Vite и PostgreSQL позволило создать понятный интерфейс и надёжную серверную часть, обеспечивающую высокую производительность и безопасность данных. В проекте реализована модульная структура, облегчающая дальнейшее сопровождение и расширение функциональности.</w:t>
       </w:r>
     </w:p>
     <w:p>
@@ -10090,7 +8692,6 @@
       </w:pPr>
       <w:bookmarkStart w:id="9" w:name="_Toc227879200"/>
       <w:r>
-        <w:lastRenderedPageBreak/>
         <w:t>Список использованных источников</w:t>
       </w:r>
       <w:bookmarkEnd w:id="9"/>
@@ -10112,15 +8713,7 @@
         <w:jc w:val="both"/>
       </w:pPr>
       <w:r>
-        <w:t xml:space="preserve">2 Документация по </w:t>
-      </w:r>
-      <w:proofErr w:type="spellStart"/>
-      <w:r>
-        <w:t>React</w:t>
-      </w:r>
-      <w:proofErr w:type="spellEnd"/>
-      <w:r>
-        <w:t xml:space="preserve"> [Электронный ресурс]. – Режим доступа: https://react.dev/. – Дата доступа: 23.04.2026.</w:t>
+        <w:t>2 Документация по React [Электронный ресурс]. – Режим доступа: https://react.dev/. – Дата доступа: 23.04.2026.</w:t>
       </w:r>
     </w:p>
     <w:p>
@@ -10130,15 +8723,7 @@
         <w:jc w:val="both"/>
       </w:pPr>
       <w:r>
-        <w:t xml:space="preserve">3 Документация по </w:t>
-      </w:r>
-      <w:proofErr w:type="spellStart"/>
-      <w:r>
-        <w:t>Vite</w:t>
-      </w:r>
-      <w:proofErr w:type="spellEnd"/>
-      <w:r>
-        <w:t xml:space="preserve"> [Электронный ресурс]. – Режим доступа: https://vite.dev/guide/. – Дата доступа: 23.04.2026.</w:t>
+        <w:t>3 Документация по Vite [Электронный ресурс]. – Режим доступа: https://vite.dev/guide/. – Дата доступа: 23.04.2026.</w:t>
       </w:r>
     </w:p>
     <w:p>
@@ -10148,15 +8733,7 @@
         <w:jc w:val="both"/>
       </w:pPr>
       <w:r>
-        <w:t xml:space="preserve">4 Документация по </w:t>
-      </w:r>
-      <w:proofErr w:type="spellStart"/>
-      <w:r>
-        <w:t>PostgreSQL</w:t>
-      </w:r>
-      <w:proofErr w:type="spellEnd"/>
-      <w:r>
-        <w:t xml:space="preserve"> [Электронный ресурс]. – Режим доступа: https://www.postgresql.org/docs/. – Дата доступа: 23.04.2026.</w:t>
+        <w:t>4 Документация по PostgreSQL [Электронный ресурс]. – Режим доступа: https://www.postgresql.org/docs/. – Дата доступа: 23.04.2026.</w:t>
       </w:r>
     </w:p>
     <w:p>
@@ -10166,15 +8743,7 @@
         <w:jc w:val="both"/>
       </w:pPr>
       <w:r>
-        <w:t xml:space="preserve">5 Документация по </w:t>
-      </w:r>
-      <w:proofErr w:type="spellStart"/>
-      <w:r>
-        <w:t>Flyway</w:t>
-      </w:r>
-      <w:proofErr w:type="spellEnd"/>
-      <w:r>
-        <w:t xml:space="preserve"> [Электронный ресурс]. – Режим доступа: https://documentation.red-gate.com/fd. – Дата доступа: 23.04.2026.</w:t>
+        <w:t>5 Документация по Flyway [Электронный ресурс]. – Режим доступа: https://documentation.red-gate.com/fd. – Дата доступа: 23.04.2026.</w:t>
       </w:r>
     </w:p>
     <w:p>
@@ -10184,15 +8753,7 @@
         <w:jc w:val="both"/>
       </w:pPr>
       <w:r>
-        <w:t xml:space="preserve">6 Документация по </w:t>
-      </w:r>
-      <w:proofErr w:type="spellStart"/>
-      <w:r>
-        <w:t>Material</w:t>
-      </w:r>
-      <w:proofErr w:type="spellEnd"/>
-      <w:r>
-        <w:t xml:space="preserve"> UI [Электронный ресурс]. – Режим доступа: https://mui.com/. – Дата доступа: 23.04.2026.</w:t>
+        <w:t>6 Документация по Material UI [Электронный ресурс]. – Режим доступа: https://mui.com/. – Дата доступа: 23.04.2026.</w:t>
       </w:r>
     </w:p>
     <w:p>
@@ -10202,15 +8763,7 @@
         <w:jc w:val="both"/>
       </w:pPr>
       <w:r>
-        <w:t xml:space="preserve">7 Документация по </w:t>
-      </w:r>
-      <w:proofErr w:type="spellStart"/>
-      <w:r>
-        <w:t>Leaflet</w:t>
-      </w:r>
-      <w:proofErr w:type="spellEnd"/>
-      <w:r>
-        <w:t xml:space="preserve"> [Электронный ресурс]. – Режим доступа: https://leafletjs.com/reference.html. – Дата доступа: 23.04.2026.</w:t>
+        <w:t>7 Документация по Leaflet [Электронный ресурс]. – Режим доступа: https://leafletjs.com/reference.html. – Дата доступа: 23.04.2026.</w:t>
       </w:r>
     </w:p>
     <w:p>

</xml_diff>